<commit_message>
changes related Mobile App APIs
</commit_message>
<xml_diff>
--- a/src/main/resources/IDIGI Mobile App APIs.docx
+++ b/src/main/resources/IDIGI Mobile App APIs.docx
@@ -4429,6 +4429,1097 @@
     <w:p>
       <w:pPr>
         <w:rPr>
+          <w:u w:val="single"/>
+        </w:rPr>
+      </w:pPr>
+      <w:r>
+        <w:rPr>
+          <w:sz w:val="20"/>
+          <w:szCs w:val="20"/>
+        </w:rPr>
+        <w:t xml:space="preserve">d. </w:t>
+      </w:r>
+      <w:r>
+        <w:rPr>
+          <w:u w:val="single"/>
+        </w:rPr>
+        <w:t>Forgot Password:</w:t>
+      </w:r>
+    </w:p>
+    <w:p>
+      <w:pPr>
+        <w:rPr>
+          <w:sz w:val="17"/>
+          <w:szCs w:val="17"/>
+        </w:rPr>
+      </w:pPr>
+      <w:proofErr w:type="spellStart"/>
+      <w:r>
+        <w:rPr>
+          <w:b/>
+          <w:sz w:val="17"/>
+          <w:szCs w:val="17"/>
+        </w:rPr>
+        <w:t>url</w:t>
+      </w:r>
+      <w:proofErr w:type="spellEnd"/>
+      <w:r>
+        <w:rPr>
+          <w:b/>
+          <w:sz w:val="17"/>
+          <w:szCs w:val="17"/>
+        </w:rPr>
+        <w:t>:</w:t>
+      </w:r>
+      <w:r>
+        <w:rPr>
+          <w:sz w:val="17"/>
+          <w:szCs w:val="17"/>
+        </w:rPr>
+        <w:t xml:space="preserve"> common URL/</w:t>
+      </w:r>
+      <w:proofErr w:type="spellStart"/>
+      <w:r>
+        <w:rPr>
+          <w:sz w:val="17"/>
+          <w:szCs w:val="17"/>
+          <w:lang w:val="en-GB"/>
+        </w:rPr>
+        <w:t>forgotpassword</w:t>
+      </w:r>
+      <w:proofErr w:type="spellEnd"/>
+      <w:r>
+        <w:rPr>
+          <w:sz w:val="17"/>
+          <w:szCs w:val="17"/>
+          <w:lang w:val="en-GB"/>
+        </w:rPr>
+        <w:t>/{</w:t>
+      </w:r>
+      <w:proofErr w:type="spellStart"/>
+      <w:r>
+        <w:rPr>
+          <w:sz w:val="17"/>
+          <w:szCs w:val="17"/>
+          <w:lang w:val="en-GB"/>
+        </w:rPr>
+        <w:t>userID</w:t>
+      </w:r>
+      <w:proofErr w:type="spellEnd"/>
+      <w:r>
+        <w:rPr>
+          <w:sz w:val="17"/>
+          <w:szCs w:val="17"/>
+          <w:lang w:val="en-GB"/>
+        </w:rPr>
+        <w:t>}</w:t>
+      </w:r>
+    </w:p>
+    <w:p>
+      <w:pPr>
+        <w:rPr>
+          <w:sz w:val="17"/>
+          <w:szCs w:val="17"/>
+        </w:rPr>
+      </w:pPr>
+      <w:r>
+        <w:rPr>
+          <w:b/>
+          <w:sz w:val="17"/>
+          <w:szCs w:val="17"/>
+        </w:rPr>
+        <w:t>Method:</w:t>
+      </w:r>
+      <w:r>
+        <w:rPr>
+          <w:sz w:val="17"/>
+          <w:szCs w:val="17"/>
+        </w:rPr>
+        <w:t xml:space="preserve"> Post</w:t>
+      </w:r>
+    </w:p>
+    <w:p>
+      <w:pPr>
+        <w:rPr>
+          <w:b/>
+        </w:rPr>
+      </w:pPr>
+      <w:r>
+        <w:rPr>
+          <w:b/>
+        </w:rPr>
+        <w:lastRenderedPageBreak/>
+        <w:t>Response:</w:t>
+      </w:r>
+    </w:p>
+    <w:p>
+      <w:pPr>
+        <w:shd w:val="clear" w:color="auto" w:fill="FFFFFF"/>
+        <w:spacing w:line="270" w:lineRule="atLeast"/>
+        <w:rPr>
+          <w:rFonts w:ascii="Monaco" w:hAnsi="Monaco"/>
+          <w:color w:val="000000"/>
+          <w:sz w:val="18"/>
+          <w:szCs w:val="18"/>
+        </w:rPr>
+      </w:pPr>
+      <w:r>
+        <w:rPr>
+          <w:rFonts w:ascii="Monaco" w:hAnsi="Monaco"/>
+          <w:color w:val="000000"/>
+          <w:sz w:val="18"/>
+          <w:szCs w:val="18"/>
+        </w:rPr>
+        <w:t>{</w:t>
+      </w:r>
+    </w:p>
+    <w:p>
+      <w:pPr>
+        <w:shd w:val="clear" w:color="auto" w:fill="FFFFFF"/>
+        <w:spacing w:line="270" w:lineRule="atLeast"/>
+        <w:rPr>
+          <w:rFonts w:ascii="Monaco" w:hAnsi="Monaco"/>
+          <w:color w:val="000000"/>
+          <w:sz w:val="18"/>
+          <w:szCs w:val="18"/>
+        </w:rPr>
+      </w:pPr>
+      <w:r>
+        <w:rPr>
+          <w:rFonts w:ascii="Monaco" w:hAnsi="Monaco"/>
+          <w:color w:val="000000"/>
+          <w:sz w:val="18"/>
+          <w:szCs w:val="18"/>
+        </w:rPr>
+        <w:t xml:space="preserve">    </w:t>
+      </w:r>
+      <w:r>
+        <w:rPr>
+          <w:rFonts w:ascii="Monaco" w:hAnsi="Monaco"/>
+          <w:color w:val="A31515"/>
+          <w:sz w:val="18"/>
+          <w:szCs w:val="18"/>
+        </w:rPr>
+        <w:t>"result"</w:t>
+      </w:r>
+      <w:r>
+        <w:rPr>
+          <w:rFonts w:ascii="Monaco" w:hAnsi="Monaco"/>
+          <w:color w:val="000000"/>
+          <w:sz w:val="18"/>
+          <w:szCs w:val="18"/>
+        </w:rPr>
+        <w:t xml:space="preserve">: </w:t>
+      </w:r>
+      <w:r>
+        <w:rPr>
+          <w:rFonts w:ascii="Monaco" w:hAnsi="Monaco"/>
+          <w:color w:val="0451A5"/>
+          <w:sz w:val="18"/>
+          <w:szCs w:val="18"/>
+        </w:rPr>
+        <w:t>"Success"</w:t>
+      </w:r>
+      <w:r>
+        <w:rPr>
+          <w:rFonts w:ascii="Monaco" w:hAnsi="Monaco"/>
+          <w:color w:val="000000"/>
+          <w:sz w:val="18"/>
+          <w:szCs w:val="18"/>
+        </w:rPr>
+        <w:t>,</w:t>
+      </w:r>
+    </w:p>
+    <w:p>
+      <w:pPr>
+        <w:shd w:val="clear" w:color="auto" w:fill="FFFFFF"/>
+        <w:spacing w:line="270" w:lineRule="atLeast"/>
+        <w:rPr>
+          <w:rFonts w:ascii="Monaco" w:hAnsi="Monaco"/>
+          <w:color w:val="000000"/>
+          <w:sz w:val="18"/>
+          <w:szCs w:val="18"/>
+        </w:rPr>
+      </w:pPr>
+      <w:r>
+        <w:rPr>
+          <w:rFonts w:ascii="Monaco" w:hAnsi="Monaco"/>
+          <w:color w:val="000000"/>
+          <w:sz w:val="18"/>
+          <w:szCs w:val="18"/>
+        </w:rPr>
+        <w:t xml:space="preserve">    </w:t>
+      </w:r>
+      <w:r>
+        <w:rPr>
+          <w:rFonts w:ascii="Monaco" w:hAnsi="Monaco"/>
+          <w:color w:val="A31515"/>
+          <w:sz w:val="18"/>
+          <w:szCs w:val="18"/>
+        </w:rPr>
+        <w:t>"Message"</w:t>
+      </w:r>
+      <w:r>
+        <w:rPr>
+          <w:rFonts w:ascii="Monaco" w:hAnsi="Monaco"/>
+          <w:color w:val="000000"/>
+          <w:sz w:val="18"/>
+          <w:szCs w:val="18"/>
+        </w:rPr>
+        <w:t xml:space="preserve">: </w:t>
+      </w:r>
+      <w:r>
+        <w:rPr>
+          <w:rFonts w:ascii="Monaco" w:hAnsi="Monaco"/>
+          <w:color w:val="0451A5"/>
+          <w:sz w:val="18"/>
+          <w:szCs w:val="18"/>
+        </w:rPr>
+        <w:t>"</w:t>
+      </w:r>
+      <w:r>
+        <w:rPr>
+          <w:rFonts w:ascii="Monaco" w:hAnsi="Monaco"/>
+          <w:color w:val="0451A5"/>
+          <w:sz w:val="18"/>
+          <w:szCs w:val="18"/>
+          <w:lang w:val="en-GB"/>
+        </w:rPr>
+        <w:t>Password has been sent to your registered email id</w:t>
+      </w:r>
+      <w:r>
+        <w:rPr>
+          <w:rFonts w:ascii="Monaco" w:hAnsi="Monaco"/>
+          <w:color w:val="0451A5"/>
+          <w:sz w:val="18"/>
+          <w:szCs w:val="18"/>
+        </w:rPr>
+        <w:t>"</w:t>
+      </w:r>
+      <w:r>
+        <w:rPr>
+          <w:rFonts w:ascii="Monaco" w:hAnsi="Monaco"/>
+          <w:color w:val="000000"/>
+          <w:sz w:val="18"/>
+          <w:szCs w:val="18"/>
+        </w:rPr>
+        <w:t>,</w:t>
+      </w:r>
+    </w:p>
+    <w:p>
+      <w:pPr>
+        <w:shd w:val="clear" w:color="auto" w:fill="FFFFFF"/>
+        <w:spacing w:line="270" w:lineRule="atLeast"/>
+        <w:rPr>
+          <w:rFonts w:ascii="Monaco" w:hAnsi="Monaco"/>
+          <w:color w:val="000000"/>
+          <w:sz w:val="18"/>
+          <w:szCs w:val="18"/>
+        </w:rPr>
+      </w:pPr>
+      <w:r>
+        <w:rPr>
+          <w:rFonts w:ascii="Monaco" w:hAnsi="Monaco"/>
+          <w:color w:val="000000"/>
+          <w:sz w:val="18"/>
+          <w:szCs w:val="18"/>
+        </w:rPr>
+        <w:t xml:space="preserve">    </w:t>
+      </w:r>
+      <w:r>
+        <w:rPr>
+          <w:rFonts w:ascii="Monaco" w:hAnsi="Monaco"/>
+          <w:color w:val="A31515"/>
+          <w:sz w:val="18"/>
+          <w:szCs w:val="18"/>
+        </w:rPr>
+        <w:t>"</w:t>
+      </w:r>
+      <w:proofErr w:type="spellStart"/>
+      <w:r>
+        <w:rPr>
+          <w:rFonts w:ascii="Monaco" w:hAnsi="Monaco"/>
+          <w:color w:val="A31515"/>
+          <w:sz w:val="18"/>
+          <w:szCs w:val="18"/>
+        </w:rPr>
+        <w:t>transactedByID</w:t>
+      </w:r>
+      <w:proofErr w:type="spellEnd"/>
+      <w:r>
+        <w:rPr>
+          <w:rFonts w:ascii="Monaco" w:hAnsi="Monaco"/>
+          <w:color w:val="A31515"/>
+          <w:sz w:val="18"/>
+          <w:szCs w:val="18"/>
+        </w:rPr>
+        <w:t>"</w:t>
+      </w:r>
+      <w:r>
+        <w:rPr>
+          <w:rFonts w:ascii="Monaco" w:hAnsi="Monaco"/>
+          <w:color w:val="000000"/>
+          <w:sz w:val="18"/>
+          <w:szCs w:val="18"/>
+        </w:rPr>
+        <w:t xml:space="preserve">: </w:t>
+      </w:r>
+      <w:r>
+        <w:rPr>
+          <w:rFonts w:ascii="Monaco" w:hAnsi="Monaco"/>
+          <w:color w:val="098658"/>
+          <w:sz w:val="18"/>
+          <w:szCs w:val="18"/>
+        </w:rPr>
+        <w:t>0</w:t>
+      </w:r>
+      <w:r>
+        <w:rPr>
+          <w:rFonts w:ascii="Monaco" w:hAnsi="Monaco"/>
+          <w:color w:val="000000"/>
+          <w:sz w:val="18"/>
+          <w:szCs w:val="18"/>
+        </w:rPr>
+        <w:t>,</w:t>
+      </w:r>
+    </w:p>
+    <w:p>
+      <w:pPr>
+        <w:shd w:val="clear" w:color="auto" w:fill="FFFFFF"/>
+        <w:spacing w:line="270" w:lineRule="atLeast"/>
+        <w:rPr>
+          <w:rFonts w:ascii="Monaco" w:hAnsi="Monaco"/>
+          <w:color w:val="000000"/>
+          <w:sz w:val="18"/>
+          <w:szCs w:val="18"/>
+        </w:rPr>
+      </w:pPr>
+      <w:r>
+        <w:rPr>
+          <w:rFonts w:ascii="Monaco" w:hAnsi="Monaco"/>
+          <w:color w:val="000000"/>
+          <w:sz w:val="18"/>
+          <w:szCs w:val="18"/>
+        </w:rPr>
+        <w:t xml:space="preserve">    </w:t>
+      </w:r>
+      <w:r>
+        <w:rPr>
+          <w:rFonts w:ascii="Monaco" w:hAnsi="Monaco"/>
+          <w:color w:val="A31515"/>
+          <w:sz w:val="18"/>
+          <w:szCs w:val="18"/>
+        </w:rPr>
+        <w:t>"</w:t>
+      </w:r>
+      <w:proofErr w:type="spellStart"/>
+      <w:r>
+        <w:rPr>
+          <w:rFonts w:ascii="Monaco" w:hAnsi="Monaco"/>
+          <w:color w:val="A31515"/>
+          <w:sz w:val="18"/>
+          <w:szCs w:val="18"/>
+        </w:rPr>
+        <w:t>transactionID</w:t>
+      </w:r>
+      <w:proofErr w:type="spellEnd"/>
+      <w:r>
+        <w:rPr>
+          <w:rFonts w:ascii="Monaco" w:hAnsi="Monaco"/>
+          <w:color w:val="A31515"/>
+          <w:sz w:val="18"/>
+          <w:szCs w:val="18"/>
+        </w:rPr>
+        <w:t>"</w:t>
+      </w:r>
+      <w:r>
+        <w:rPr>
+          <w:rFonts w:ascii="Monaco" w:hAnsi="Monaco"/>
+          <w:color w:val="000000"/>
+          <w:sz w:val="18"/>
+          <w:szCs w:val="18"/>
+        </w:rPr>
+        <w:t xml:space="preserve">: </w:t>
+      </w:r>
+      <w:r>
+        <w:rPr>
+          <w:rFonts w:ascii="Monaco" w:hAnsi="Monaco"/>
+          <w:color w:val="098658"/>
+          <w:sz w:val="18"/>
+          <w:szCs w:val="18"/>
+        </w:rPr>
+        <w:t>0</w:t>
+      </w:r>
+    </w:p>
+    <w:p>
+      <w:pPr>
+        <w:shd w:val="clear" w:color="auto" w:fill="FFFFFF"/>
+        <w:spacing w:line="270" w:lineRule="atLeast"/>
+        <w:rPr>
+          <w:rFonts w:ascii="Monaco" w:hAnsi="Monaco"/>
+          <w:color w:val="000000"/>
+          <w:sz w:val="18"/>
+          <w:szCs w:val="18"/>
+        </w:rPr>
+      </w:pPr>
+      <w:r>
+        <w:rPr>
+          <w:rFonts w:ascii="Monaco" w:hAnsi="Monaco"/>
+          <w:color w:val="000000"/>
+          <w:sz w:val="18"/>
+          <w:szCs w:val="18"/>
+        </w:rPr>
+        <w:t>}</w:t>
+      </w:r>
+    </w:p>
+    <w:p>
+      <w:pPr>
+        <w:rPr>
+          <w:b/>
+        </w:rPr>
+      </w:pPr>
+    </w:p>
+    <w:p>
+      <w:pPr>
+        <w:rPr>
+          <w:u w:val="single"/>
+        </w:rPr>
+      </w:pPr>
+      <w:r>
+        <w:rPr>
+          <w:sz w:val="20"/>
+          <w:szCs w:val="20"/>
+        </w:rPr>
+        <w:t xml:space="preserve">e. </w:t>
+      </w:r>
+      <w:r>
+        <w:rPr>
+          <w:u w:val="single"/>
+        </w:rPr>
+        <w:t>Change Password:</w:t>
+      </w:r>
+    </w:p>
+    <w:p>
+      <w:pPr>
+        <w:rPr>
+          <w:sz w:val="17"/>
+          <w:szCs w:val="17"/>
+        </w:rPr>
+      </w:pPr>
+      <w:proofErr w:type="spellStart"/>
+      <w:r>
+        <w:rPr>
+          <w:b/>
+          <w:sz w:val="17"/>
+          <w:szCs w:val="17"/>
+        </w:rPr>
+        <w:t>url</w:t>
+      </w:r>
+      <w:proofErr w:type="spellEnd"/>
+      <w:r>
+        <w:rPr>
+          <w:b/>
+          <w:sz w:val="17"/>
+          <w:szCs w:val="17"/>
+        </w:rPr>
+        <w:t>:</w:t>
+      </w:r>
+      <w:r>
+        <w:rPr>
+          <w:sz w:val="17"/>
+          <w:szCs w:val="17"/>
+        </w:rPr>
+        <w:t xml:space="preserve"> common URL/</w:t>
+      </w:r>
+      <w:proofErr w:type="spellStart"/>
+      <w:r>
+        <w:rPr>
+          <w:sz w:val="17"/>
+          <w:szCs w:val="17"/>
+        </w:rPr>
+        <w:t>changepassword</w:t>
+      </w:r>
+      <w:proofErr w:type="spellEnd"/>
+      <w:r>
+        <w:rPr>
+          <w:sz w:val="17"/>
+          <w:szCs w:val="17"/>
+        </w:rPr>
+        <w:t>/{</w:t>
+      </w:r>
+      <w:proofErr w:type="spellStart"/>
+      <w:r>
+        <w:rPr>
+          <w:sz w:val="17"/>
+          <w:szCs w:val="17"/>
+        </w:rPr>
+        <w:t>userID</w:t>
+      </w:r>
+      <w:proofErr w:type="spellEnd"/>
+      <w:r>
+        <w:rPr>
+          <w:sz w:val="17"/>
+          <w:szCs w:val="17"/>
+        </w:rPr>
+        <w:t>}</w:t>
+      </w:r>
+    </w:p>
+    <w:p>
+      <w:pPr>
+        <w:rPr>
+          <w:sz w:val="17"/>
+          <w:szCs w:val="17"/>
+        </w:rPr>
+      </w:pPr>
+      <w:r>
+        <w:rPr>
+          <w:b/>
+          <w:sz w:val="17"/>
+          <w:szCs w:val="17"/>
+        </w:rPr>
+        <w:t>Method:</w:t>
+      </w:r>
+      <w:r>
+        <w:rPr>
+          <w:sz w:val="17"/>
+          <w:szCs w:val="17"/>
+        </w:rPr>
+        <w:t xml:space="preserve"> Post</w:t>
+      </w:r>
+    </w:p>
+    <w:p>
+      <w:pPr>
+        <w:rPr>
+          <w:b/>
+        </w:rPr>
+      </w:pPr>
+      <w:r>
+        <w:rPr>
+          <w:b/>
+        </w:rPr>
+        <w:t>Request:</w:t>
+      </w:r>
+    </w:p>
+    <w:p>
+      <w:pPr>
+        <w:shd w:val="clear" w:color="auto" w:fill="FFFFFF"/>
+        <w:spacing w:line="270" w:lineRule="atLeast"/>
+        <w:rPr>
+          <w:rFonts w:ascii="Monaco" w:hAnsi="Monaco"/>
+          <w:color w:val="000000"/>
+          <w:sz w:val="18"/>
+          <w:szCs w:val="18"/>
+        </w:rPr>
+      </w:pPr>
+      <w:r>
+        <w:rPr>
+          <w:rFonts w:ascii="Monaco" w:hAnsi="Monaco"/>
+          <w:color w:val="000000"/>
+          <w:sz w:val="18"/>
+          <w:szCs w:val="18"/>
+        </w:rPr>
+        <w:t>{</w:t>
+      </w:r>
+    </w:p>
+    <w:p>
+      <w:pPr>
+        <w:shd w:val="clear" w:color="auto" w:fill="FFFFFF"/>
+        <w:spacing w:line="270" w:lineRule="atLeast"/>
+        <w:rPr>
+          <w:rFonts w:ascii="Monaco" w:hAnsi="Monaco"/>
+          <w:color w:val="000000"/>
+          <w:sz w:val="18"/>
+          <w:szCs w:val="18"/>
+        </w:rPr>
+      </w:pPr>
+      <w:r>
+        <w:rPr>
+          <w:rFonts w:ascii="Monaco" w:hAnsi="Monaco"/>
+          <w:color w:val="000000"/>
+          <w:sz w:val="18"/>
+          <w:szCs w:val="18"/>
+        </w:rPr>
+        <w:t xml:space="preserve">    </w:t>
+      </w:r>
+      <w:r>
+        <w:rPr>
+          <w:rFonts w:ascii="Monaco" w:hAnsi="Monaco"/>
+          <w:color w:val="A31515"/>
+          <w:sz w:val="18"/>
+          <w:szCs w:val="18"/>
+        </w:rPr>
+        <w:t>"</w:t>
+      </w:r>
+      <w:proofErr w:type="spellStart"/>
+      <w:r>
+        <w:rPr>
+          <w:rFonts w:ascii="Monaco" w:hAnsi="Monaco"/>
+          <w:color w:val="A31515"/>
+          <w:sz w:val="18"/>
+          <w:szCs w:val="18"/>
+        </w:rPr>
+        <w:t>oldPassword</w:t>
+      </w:r>
+      <w:proofErr w:type="spellEnd"/>
+      <w:r>
+        <w:rPr>
+          <w:rFonts w:ascii="Monaco" w:hAnsi="Monaco"/>
+          <w:color w:val="A31515"/>
+          <w:sz w:val="18"/>
+          <w:szCs w:val="18"/>
+        </w:rPr>
+        <w:t>"</w:t>
+      </w:r>
+      <w:r>
+        <w:rPr>
+          <w:rFonts w:ascii="Monaco" w:hAnsi="Monaco"/>
+          <w:color w:val="000000"/>
+          <w:sz w:val="18"/>
+          <w:szCs w:val="18"/>
+        </w:rPr>
+        <w:t xml:space="preserve"> : </w:t>
+      </w:r>
+      <w:r>
+        <w:rPr>
+          <w:rFonts w:ascii="Monaco" w:hAnsi="Monaco"/>
+          <w:color w:val="0451A5"/>
+          <w:sz w:val="18"/>
+          <w:szCs w:val="18"/>
+        </w:rPr>
+        <w:t>"Admin"</w:t>
+      </w:r>
+      <w:r>
+        <w:rPr>
+          <w:rFonts w:ascii="Monaco" w:hAnsi="Monaco"/>
+          <w:color w:val="000000"/>
+          <w:sz w:val="18"/>
+          <w:szCs w:val="18"/>
+        </w:rPr>
+        <w:t>,</w:t>
+      </w:r>
+    </w:p>
+    <w:p>
+      <w:pPr>
+        <w:shd w:val="clear" w:color="auto" w:fill="FFFFFF"/>
+        <w:spacing w:line="270" w:lineRule="atLeast"/>
+        <w:rPr>
+          <w:rFonts w:ascii="Monaco" w:hAnsi="Monaco"/>
+          <w:color w:val="000000"/>
+          <w:sz w:val="18"/>
+          <w:szCs w:val="18"/>
+        </w:rPr>
+      </w:pPr>
+      <w:r>
+        <w:rPr>
+          <w:rFonts w:ascii="Monaco" w:hAnsi="Monaco"/>
+          <w:color w:val="000000"/>
+          <w:sz w:val="18"/>
+          <w:szCs w:val="18"/>
+        </w:rPr>
+        <w:t xml:space="preserve">    </w:t>
+      </w:r>
+      <w:r>
+        <w:rPr>
+          <w:rFonts w:ascii="Monaco" w:hAnsi="Monaco"/>
+          <w:color w:val="A31515"/>
+          <w:sz w:val="18"/>
+          <w:szCs w:val="18"/>
+        </w:rPr>
+        <w:t>"</w:t>
+      </w:r>
+      <w:proofErr w:type="spellStart"/>
+      <w:r>
+        <w:rPr>
+          <w:rFonts w:ascii="Monaco" w:hAnsi="Monaco"/>
+          <w:color w:val="A31515"/>
+          <w:sz w:val="18"/>
+          <w:szCs w:val="18"/>
+        </w:rPr>
+        <w:t>newPassword</w:t>
+      </w:r>
+      <w:proofErr w:type="spellEnd"/>
+      <w:r>
+        <w:rPr>
+          <w:rFonts w:ascii="Monaco" w:hAnsi="Monaco"/>
+          <w:color w:val="A31515"/>
+          <w:sz w:val="18"/>
+          <w:szCs w:val="18"/>
+        </w:rPr>
+        <w:t>"</w:t>
+      </w:r>
+      <w:r>
+        <w:rPr>
+          <w:rFonts w:ascii="Monaco" w:hAnsi="Monaco"/>
+          <w:color w:val="000000"/>
+          <w:sz w:val="18"/>
+          <w:szCs w:val="18"/>
+        </w:rPr>
+        <w:t xml:space="preserve"> : </w:t>
+      </w:r>
+      <w:r>
+        <w:rPr>
+          <w:rFonts w:ascii="Monaco" w:hAnsi="Monaco"/>
+          <w:color w:val="0451A5"/>
+          <w:sz w:val="18"/>
+          <w:szCs w:val="18"/>
+        </w:rPr>
+        <w:t>"Admin1"</w:t>
+      </w:r>
+    </w:p>
+    <w:p>
+      <w:pPr>
+        <w:shd w:val="clear" w:color="auto" w:fill="FFFFFF"/>
+        <w:spacing w:line="270" w:lineRule="atLeast"/>
+        <w:rPr>
+          <w:rFonts w:ascii="Monaco" w:hAnsi="Monaco"/>
+          <w:color w:val="000000"/>
+          <w:sz w:val="18"/>
+          <w:szCs w:val="18"/>
+        </w:rPr>
+      </w:pPr>
+      <w:r>
+        <w:rPr>
+          <w:rFonts w:ascii="Monaco" w:hAnsi="Monaco"/>
+          <w:color w:val="000000"/>
+          <w:sz w:val="18"/>
+          <w:szCs w:val="18"/>
+        </w:rPr>
+        <w:t>}</w:t>
+      </w:r>
+    </w:p>
+    <w:p>
+      <w:pPr>
+        <w:rPr>
+          <w:b/>
+        </w:rPr>
+      </w:pPr>
+      <w:r>
+        <w:rPr>
+          <w:b/>
+        </w:rPr>
+        <w:t>Response:</w:t>
+      </w:r>
+    </w:p>
+    <w:p>
+      <w:pPr>
+        <w:shd w:val="clear" w:color="auto" w:fill="FFFFFF"/>
+        <w:spacing w:line="270" w:lineRule="atLeast"/>
+        <w:rPr>
+          <w:rFonts w:ascii="Monaco" w:hAnsi="Monaco"/>
+          <w:color w:val="000000"/>
+          <w:sz w:val="18"/>
+          <w:szCs w:val="18"/>
+        </w:rPr>
+      </w:pPr>
+      <w:r>
+        <w:rPr>
+          <w:rFonts w:ascii="Monaco" w:hAnsi="Monaco"/>
+          <w:color w:val="000000"/>
+          <w:sz w:val="18"/>
+          <w:szCs w:val="18"/>
+        </w:rPr>
+        <w:t>{</w:t>
+      </w:r>
+    </w:p>
+    <w:p>
+      <w:pPr>
+        <w:shd w:val="clear" w:color="auto" w:fill="FFFFFF"/>
+        <w:spacing w:line="270" w:lineRule="atLeast"/>
+        <w:rPr>
+          <w:rFonts w:ascii="Monaco" w:hAnsi="Monaco"/>
+          <w:color w:val="000000"/>
+          <w:sz w:val="18"/>
+          <w:szCs w:val="18"/>
+        </w:rPr>
+      </w:pPr>
+      <w:r>
+        <w:rPr>
+          <w:rFonts w:ascii="Monaco" w:hAnsi="Monaco"/>
+          <w:color w:val="000000"/>
+          <w:sz w:val="18"/>
+          <w:szCs w:val="18"/>
+        </w:rPr>
+        <w:t xml:space="preserve">    </w:t>
+      </w:r>
+      <w:r>
+        <w:rPr>
+          <w:rFonts w:ascii="Monaco" w:hAnsi="Monaco"/>
+          <w:color w:val="A31515"/>
+          <w:sz w:val="18"/>
+          <w:szCs w:val="18"/>
+        </w:rPr>
+        <w:t>"result"</w:t>
+      </w:r>
+      <w:r>
+        <w:rPr>
+          <w:rFonts w:ascii="Monaco" w:hAnsi="Monaco"/>
+          <w:color w:val="000000"/>
+          <w:sz w:val="18"/>
+          <w:szCs w:val="18"/>
+        </w:rPr>
+        <w:t xml:space="preserve">: </w:t>
+      </w:r>
+      <w:r>
+        <w:rPr>
+          <w:rFonts w:ascii="Monaco" w:hAnsi="Monaco"/>
+          <w:color w:val="0451A5"/>
+          <w:sz w:val="18"/>
+          <w:szCs w:val="18"/>
+        </w:rPr>
+        <w:t>"Success"</w:t>
+      </w:r>
+      <w:r>
+        <w:rPr>
+          <w:rFonts w:ascii="Monaco" w:hAnsi="Monaco"/>
+          <w:color w:val="000000"/>
+          <w:sz w:val="18"/>
+          <w:szCs w:val="18"/>
+        </w:rPr>
+        <w:t>,</w:t>
+      </w:r>
+    </w:p>
+    <w:p>
+      <w:pPr>
+        <w:shd w:val="clear" w:color="auto" w:fill="FFFFFF"/>
+        <w:spacing w:line="270" w:lineRule="atLeast"/>
+        <w:rPr>
+          <w:rFonts w:ascii="Monaco" w:hAnsi="Monaco"/>
+          <w:color w:val="000000"/>
+          <w:sz w:val="18"/>
+          <w:szCs w:val="18"/>
+        </w:rPr>
+      </w:pPr>
+      <w:r>
+        <w:rPr>
+          <w:rFonts w:ascii="Monaco" w:hAnsi="Monaco"/>
+          <w:color w:val="000000"/>
+          <w:sz w:val="18"/>
+          <w:szCs w:val="18"/>
+        </w:rPr>
+        <w:t xml:space="preserve">    </w:t>
+      </w:r>
+      <w:r>
+        <w:rPr>
+          <w:rFonts w:ascii="Monaco" w:hAnsi="Monaco"/>
+          <w:color w:val="A31515"/>
+          <w:sz w:val="18"/>
+          <w:szCs w:val="18"/>
+        </w:rPr>
+        <w:t>"Message"</w:t>
+      </w:r>
+      <w:r>
+        <w:rPr>
+          <w:rFonts w:ascii="Monaco" w:hAnsi="Monaco"/>
+          <w:color w:val="000000"/>
+          <w:sz w:val="18"/>
+          <w:szCs w:val="18"/>
+        </w:rPr>
+        <w:t xml:space="preserve">: </w:t>
+      </w:r>
+      <w:r>
+        <w:rPr>
+          <w:rFonts w:ascii="Monaco" w:hAnsi="Monaco"/>
+          <w:color w:val="0451A5"/>
+          <w:sz w:val="18"/>
+          <w:szCs w:val="18"/>
+        </w:rPr>
+        <w:t>"Password Updated Successfully"</w:t>
+      </w:r>
+      <w:r>
+        <w:rPr>
+          <w:rFonts w:ascii="Monaco" w:hAnsi="Monaco"/>
+          <w:color w:val="000000"/>
+          <w:sz w:val="18"/>
+          <w:szCs w:val="18"/>
+        </w:rPr>
+        <w:t>,</w:t>
+      </w:r>
+    </w:p>
+    <w:p>
+      <w:pPr>
+        <w:shd w:val="clear" w:color="auto" w:fill="FFFFFF"/>
+        <w:spacing w:line="270" w:lineRule="atLeast"/>
+        <w:rPr>
+          <w:rFonts w:ascii="Monaco" w:hAnsi="Monaco"/>
+          <w:color w:val="000000"/>
+          <w:sz w:val="18"/>
+          <w:szCs w:val="18"/>
+        </w:rPr>
+      </w:pPr>
+      <w:r>
+        <w:rPr>
+          <w:rFonts w:ascii="Monaco" w:hAnsi="Monaco"/>
+          <w:color w:val="000000"/>
+          <w:sz w:val="18"/>
+          <w:szCs w:val="18"/>
+        </w:rPr>
+        <w:t xml:space="preserve">    </w:t>
+      </w:r>
+      <w:r>
+        <w:rPr>
+          <w:rFonts w:ascii="Monaco" w:hAnsi="Monaco"/>
+          <w:color w:val="A31515"/>
+          <w:sz w:val="18"/>
+          <w:szCs w:val="18"/>
+        </w:rPr>
+        <w:t>"</w:t>
+      </w:r>
+      <w:proofErr w:type="spellStart"/>
+      <w:r>
+        <w:rPr>
+          <w:rFonts w:ascii="Monaco" w:hAnsi="Monaco"/>
+          <w:color w:val="A31515"/>
+          <w:sz w:val="18"/>
+          <w:szCs w:val="18"/>
+        </w:rPr>
+        <w:t>transactedByID</w:t>
+      </w:r>
+      <w:proofErr w:type="spellEnd"/>
+      <w:r>
+        <w:rPr>
+          <w:rFonts w:ascii="Monaco" w:hAnsi="Monaco"/>
+          <w:color w:val="A31515"/>
+          <w:sz w:val="18"/>
+          <w:szCs w:val="18"/>
+        </w:rPr>
+        <w:t>"</w:t>
+      </w:r>
+      <w:r>
+        <w:rPr>
+          <w:rFonts w:ascii="Monaco" w:hAnsi="Monaco"/>
+          <w:color w:val="000000"/>
+          <w:sz w:val="18"/>
+          <w:szCs w:val="18"/>
+        </w:rPr>
+        <w:t xml:space="preserve">: </w:t>
+      </w:r>
+      <w:r>
+        <w:rPr>
+          <w:rFonts w:ascii="Monaco" w:hAnsi="Monaco"/>
+          <w:color w:val="098658"/>
+          <w:sz w:val="18"/>
+          <w:szCs w:val="18"/>
+        </w:rPr>
+        <w:t>0</w:t>
+      </w:r>
+      <w:r>
+        <w:rPr>
+          <w:rFonts w:ascii="Monaco" w:hAnsi="Monaco"/>
+          <w:color w:val="000000"/>
+          <w:sz w:val="18"/>
+          <w:szCs w:val="18"/>
+        </w:rPr>
+        <w:t>,</w:t>
+      </w:r>
+    </w:p>
+    <w:p>
+      <w:pPr>
+        <w:shd w:val="clear" w:color="auto" w:fill="FFFFFF"/>
+        <w:spacing w:line="270" w:lineRule="atLeast"/>
+        <w:rPr>
+          <w:rFonts w:ascii="Monaco" w:hAnsi="Monaco"/>
+          <w:color w:val="000000"/>
+          <w:sz w:val="18"/>
+          <w:szCs w:val="18"/>
+        </w:rPr>
+      </w:pPr>
+      <w:r>
+        <w:rPr>
+          <w:rFonts w:ascii="Monaco" w:hAnsi="Monaco"/>
+          <w:color w:val="000000"/>
+          <w:sz w:val="18"/>
+          <w:szCs w:val="18"/>
+        </w:rPr>
+        <w:t xml:space="preserve">    </w:t>
+      </w:r>
+      <w:r>
+        <w:rPr>
+          <w:rFonts w:ascii="Monaco" w:hAnsi="Monaco"/>
+          <w:color w:val="A31515"/>
+          <w:sz w:val="18"/>
+          <w:szCs w:val="18"/>
+        </w:rPr>
+        <w:t>"</w:t>
+      </w:r>
+      <w:proofErr w:type="spellStart"/>
+      <w:r>
+        <w:rPr>
+          <w:rFonts w:ascii="Monaco" w:hAnsi="Monaco"/>
+          <w:color w:val="A31515"/>
+          <w:sz w:val="18"/>
+          <w:szCs w:val="18"/>
+        </w:rPr>
+        <w:t>transactionID</w:t>
+      </w:r>
+      <w:proofErr w:type="spellEnd"/>
+      <w:r>
+        <w:rPr>
+          <w:rFonts w:ascii="Monaco" w:hAnsi="Monaco"/>
+          <w:color w:val="A31515"/>
+          <w:sz w:val="18"/>
+          <w:szCs w:val="18"/>
+        </w:rPr>
+        <w:t>"</w:t>
+      </w:r>
+      <w:r>
+        <w:rPr>
+          <w:rFonts w:ascii="Monaco" w:hAnsi="Monaco"/>
+          <w:color w:val="000000"/>
+          <w:sz w:val="18"/>
+          <w:szCs w:val="18"/>
+        </w:rPr>
+        <w:t xml:space="preserve">: </w:t>
+      </w:r>
+      <w:r>
+        <w:rPr>
+          <w:rFonts w:ascii="Monaco" w:hAnsi="Monaco"/>
+          <w:color w:val="098658"/>
+          <w:sz w:val="18"/>
+          <w:szCs w:val="18"/>
+        </w:rPr>
+        <w:t>0</w:t>
+      </w:r>
+    </w:p>
+    <w:p>
+      <w:pPr>
+        <w:shd w:val="clear" w:color="auto" w:fill="FFFFFF"/>
+        <w:spacing w:line="270" w:lineRule="atLeast"/>
+        <w:rPr>
+          <w:rFonts w:ascii="Monaco" w:hAnsi="Monaco"/>
+          <w:color w:val="000000"/>
+          <w:sz w:val="18"/>
+          <w:szCs w:val="18"/>
+        </w:rPr>
+      </w:pPr>
+      <w:r>
+        <w:rPr>
+          <w:rFonts w:ascii="Monaco" w:hAnsi="Monaco"/>
+          <w:color w:val="000000"/>
+          <w:sz w:val="18"/>
+          <w:szCs w:val="18"/>
+        </w:rPr>
+        <w:t>}</w:t>
+      </w:r>
+    </w:p>
+    <w:p>
+      <w:pPr>
+        <w:rPr>
+          <w:b/>
+        </w:rPr>
+      </w:pPr>
+    </w:p>
+    <w:p>
+      <w:pPr>
+        <w:shd w:val="clear" w:color="auto" w:fill="FFFFFE"/>
+        <w:rPr>
+          <w:sz w:val="20"/>
+          <w:szCs w:val="20"/>
+        </w:rPr>
+      </w:pPr>
+    </w:p>
+    <w:p>
+      <w:pPr>
+        <w:rPr>
           <w:b/>
           <w:u w:val="single"/>
         </w:rPr>
@@ -4519,7 +5610,6 @@
           <w:sz w:val="19"/>
           <w:szCs w:val="19"/>
         </w:rPr>
-        <w:lastRenderedPageBreak/>
         <w:t>Method:</w:t>
       </w:r>
       <w:r>
@@ -5304,6 +6394,7 @@
           <w:sz w:val="18"/>
           <w:szCs w:val="18"/>
         </w:rPr>
+        <w:lastRenderedPageBreak/>
         <w:t>// gas 1122</w:t>
       </w:r>
     </w:p>
@@ -6264,7 +7355,6 @@
           <w:sz w:val="17"/>
           <w:szCs w:val="17"/>
         </w:rPr>
-        <w:lastRenderedPageBreak/>
         <w:t>Request:</w:t>
       </w:r>
     </w:p>
@@ -7335,6 +8425,7 @@
           <w:sz w:val="18"/>
           <w:szCs w:val="18"/>
         </w:rPr>
+        <w:lastRenderedPageBreak/>
         <w:tab/>
         <w:t>“</w:t>
       </w:r>
@@ -8311,7 +9402,6 @@
           <w:sz w:val="18"/>
           <w:szCs w:val="18"/>
         </w:rPr>
-        <w:lastRenderedPageBreak/>
         <w:tab/>
         <w:t>"</w:t>
       </w:r>
@@ -9090,6 +10180,7 @@
         <w:shd w:val="clear" w:color="auto" w:fill="FFFFFE"/>
       </w:pPr>
       <w:r>
+        <w:lastRenderedPageBreak/>
         <w:t>{</w:t>
       </w:r>
     </w:p>
@@ -9985,7 +11076,6 @@
         <w:shd w:val="clear" w:color="auto" w:fill="FFFFFE"/>
       </w:pPr>
       <w:r>
-        <w:lastRenderedPageBreak/>
         <w:t xml:space="preserve">            </w:t>
       </w:r>
       <w:r>
@@ -10700,6 +11790,7 @@
         <w:shd w:val="clear" w:color="auto" w:fill="FFFFFE"/>
       </w:pPr>
       <w:r>
+        <w:lastRenderedPageBreak/>
         <w:t>Pdf will be downloaded</w:t>
       </w:r>
     </w:p>
@@ -11677,7 +12768,7 @@
           <w:szCs w:val="19"/>
           <w:lang w:val="en-GB"/>
         </w:rPr>
-        <w:t>houseNumber</w:t>
+        <w:t>customerID</w:t>
       </w:r>
       <w:proofErr w:type="spellEnd"/>
       <w:r>
@@ -11768,7 +12859,6 @@
           <w:sz w:val="18"/>
           <w:szCs w:val="18"/>
         </w:rPr>
-        <w:lastRenderedPageBreak/>
         <w:t xml:space="preserve">    </w:t>
       </w:r>
       <w:r>
@@ -12432,6 +13522,102 @@
           <w:szCs w:val="18"/>
         </w:rPr>
         <w:t>0</w:t>
+      </w:r>
+      <w:r>
+        <w:rPr>
+          <w:rFonts w:ascii="Monaco" w:hAnsi="Monaco"/>
+          <w:color w:val="000000"/>
+          <w:sz w:val="18"/>
+          <w:szCs w:val="18"/>
+        </w:rPr>
+        <w:t>,</w:t>
+      </w:r>
+    </w:p>
+    <w:p>
+      <w:pPr>
+        <w:shd w:val="clear" w:color="auto" w:fill="FFFFFF"/>
+        <w:spacing w:line="270" w:lineRule="atLeast"/>
+        <w:rPr>
+          <w:rFonts w:ascii="Monaco" w:hAnsi="Monaco"/>
+          <w:color w:val="000000"/>
+          <w:sz w:val="18"/>
+          <w:szCs w:val="18"/>
+        </w:rPr>
+      </w:pPr>
+      <w:r>
+        <w:rPr>
+          <w:rFonts w:ascii="Monaco" w:hAnsi="Monaco"/>
+          <w:color w:val="000000"/>
+          <w:sz w:val="18"/>
+          <w:szCs w:val="18"/>
+        </w:rPr>
+        <w:tab/>
+        <w:t xml:space="preserve"> </w:t>
+      </w:r>
+      <w:r>
+        <w:rPr>
+          <w:rFonts w:ascii="Monaco" w:hAnsi="Monaco"/>
+          <w:color w:val="A31515"/>
+          <w:sz w:val="18"/>
+          <w:szCs w:val="18"/>
+        </w:rPr>
+        <w:t>"</w:t>
+      </w:r>
+      <w:proofErr w:type="spellStart"/>
+      <w:r>
+        <w:rPr>
+          <w:rFonts w:ascii="Monaco" w:hAnsi="Monaco"/>
+          <w:color w:val="A31515"/>
+          <w:sz w:val="18"/>
+          <w:szCs w:val="18"/>
+        </w:rPr>
+        <w:t>houseNumber</w:t>
+      </w:r>
+      <w:proofErr w:type="spellEnd"/>
+      <w:r>
+        <w:rPr>
+          <w:rFonts w:ascii="Monaco" w:hAnsi="Monaco"/>
+          <w:color w:val="A31515"/>
+          <w:sz w:val="18"/>
+          <w:szCs w:val="18"/>
+        </w:rPr>
+        <w:t>"</w:t>
+      </w:r>
+      <w:r>
+        <w:rPr>
+          <w:rFonts w:ascii="Monaco" w:hAnsi="Monaco"/>
+          <w:color w:val="000000"/>
+          <w:sz w:val="18"/>
+          <w:szCs w:val="18"/>
+        </w:rPr>
+        <w:t xml:space="preserve">: </w:t>
+      </w:r>
+      <w:r>
+        <w:rPr>
+          <w:rFonts w:ascii="Monaco" w:hAnsi="Monaco"/>
+          <w:color w:val="0451A5"/>
+          <w:sz w:val="18"/>
+          <w:szCs w:val="18"/>
+        </w:rPr>
+        <w:t>"</w:t>
+      </w:r>
+      <w:r>
+        <w:rPr>
+          <w:rFonts w:ascii="Monaco" w:hAnsi="Monaco"/>
+          <w:color w:val="0451A5"/>
+          <w:sz w:val="18"/>
+          <w:szCs w:val="18"/>
+        </w:rPr>
+        <w:t>Villa-22</w:t>
+      </w:r>
+      <w:r>
+        <w:rPr>
+          <w:rFonts w:ascii="Monaco" w:hAnsi="Monaco"/>
+          <w:color w:val="0451A5"/>
+          <w:sz w:val="18"/>
+          <w:szCs w:val="18"/>
+        </w:rPr>
+        <w:t>"</w:t>
       </w:r>
       <w:r>
         <w:rPr>
@@ -12711,7 +13897,23 @@
           <w:sz w:val="18"/>
           <w:szCs w:val="18"/>
         </w:rPr>
-        <w:t xml:space="preserve"> In case device is not registered</w:t>
+        <w:t xml:space="preserve"> In case </w:t>
+      </w:r>
+      <w:proofErr w:type="spellStart"/>
+      <w:r>
+        <w:rPr>
+          <w:sz w:val="18"/>
+          <w:szCs w:val="18"/>
+        </w:rPr>
+        <w:t>housenumber</w:t>
+      </w:r>
+      <w:proofErr w:type="spellEnd"/>
+      <w:r>
+        <w:rPr>
+          <w:sz w:val="18"/>
+          <w:szCs w:val="18"/>
+        </w:rPr>
+        <w:t xml:space="preserve"> is not registered</w:t>
       </w:r>
     </w:p>
     <w:p>
@@ -12944,6 +14146,7 @@
           <w:sz w:val="18"/>
           <w:szCs w:val="18"/>
         </w:rPr>
+        <w:lastRenderedPageBreak/>
         <w:t xml:space="preserve">    </w:t>
       </w:r>
       <w:r>
@@ -14079,7 +15282,6 @@
           <w:sz w:val="19"/>
           <w:szCs w:val="19"/>
         </w:rPr>
-        <w:lastRenderedPageBreak/>
         <w:t>// if already a request is pending</w:t>
       </w:r>
     </w:p>
@@ -14914,6 +16116,7 @@
           <w:sz w:val="18"/>
           <w:szCs w:val="18"/>
         </w:rPr>
+        <w:lastRenderedPageBreak/>
         <w:t xml:space="preserve">        </w:t>
       </w:r>
       <w:r>
@@ -16430,7 +17633,6 @@
           <w:sz w:val="19"/>
           <w:szCs w:val="19"/>
         </w:rPr>
-        <w:lastRenderedPageBreak/>
         <w:t>// If rejected</w:t>
       </w:r>
     </w:p>
@@ -17378,810 +18580,6 @@
           <w:szCs w:val="18"/>
         </w:rPr>
       </w:pPr>
-    </w:p>
-    <w:p>
-      <w:pPr>
-        <w:rPr>
-          <w:b/>
-          <w:u w:val="single"/>
-        </w:rPr>
-      </w:pPr>
-      <w:r>
-        <w:rPr>
-          <w:b/>
-          <w:u w:val="single"/>
-        </w:rPr>
-        <w:t>11.to approve the customer update request: (not to implement, just for information)</w:t>
-      </w:r>
-    </w:p>
-    <w:p>
-      <w:pPr>
-        <w:rPr>
-          <w:sz w:val="20"/>
-          <w:szCs w:val="20"/>
-        </w:rPr>
-      </w:pPr>
-      <w:proofErr w:type="spellStart"/>
-      <w:r>
-        <w:rPr>
-          <w:b/>
-          <w:sz w:val="19"/>
-          <w:szCs w:val="19"/>
-        </w:rPr>
-        <w:t>url</w:t>
-      </w:r>
-      <w:proofErr w:type="spellEnd"/>
-      <w:r>
-        <w:rPr>
-          <w:b/>
-          <w:sz w:val="19"/>
-          <w:szCs w:val="19"/>
-        </w:rPr>
-        <w:t>:</w:t>
-      </w:r>
-      <w:r>
-        <w:rPr>
-          <w:sz w:val="19"/>
-          <w:szCs w:val="19"/>
-        </w:rPr>
-        <w:t xml:space="preserve"> common URL/</w:t>
-      </w:r>
-      <w:proofErr w:type="spellStart"/>
-      <w:r>
-        <w:rPr>
-          <w:sz w:val="20"/>
-          <w:szCs w:val="20"/>
-          <w:lang w:val="en-GB"/>
-        </w:rPr>
-        <w:t>approverequest</w:t>
-      </w:r>
-      <w:proofErr w:type="spellEnd"/>
-      <w:r>
-        <w:rPr>
-          <w:sz w:val="20"/>
-          <w:szCs w:val="20"/>
-          <w:lang w:val="en-GB"/>
-        </w:rPr>
-        <w:t>/{</w:t>
-      </w:r>
-      <w:proofErr w:type="spellStart"/>
-      <w:r>
-        <w:rPr>
-          <w:sz w:val="20"/>
-          <w:szCs w:val="20"/>
-          <w:lang w:val="en-GB"/>
-        </w:rPr>
-        <w:t>requestID</w:t>
-      </w:r>
-      <w:proofErr w:type="spellEnd"/>
-      <w:r>
-        <w:rPr>
-          <w:sz w:val="20"/>
-          <w:szCs w:val="20"/>
-          <w:lang w:val="en-GB"/>
-        </w:rPr>
-        <w:t>}/{action}</w:t>
-      </w:r>
-    </w:p>
-    <w:p>
-      <w:pPr>
-        <w:rPr>
-          <w:sz w:val="19"/>
-          <w:szCs w:val="19"/>
-        </w:rPr>
-      </w:pPr>
-      <w:r>
-        <w:rPr>
-          <w:b/>
-          <w:sz w:val="19"/>
-          <w:szCs w:val="19"/>
-        </w:rPr>
-        <w:t>Method:</w:t>
-      </w:r>
-      <w:r>
-        <w:rPr>
-          <w:sz w:val="19"/>
-          <w:szCs w:val="19"/>
-        </w:rPr>
-        <w:t xml:space="preserve"> POST</w:t>
-      </w:r>
-    </w:p>
-    <w:p>
-      <w:pPr>
-        <w:rPr>
-          <w:b/>
-          <w:sz w:val="19"/>
-          <w:szCs w:val="19"/>
-        </w:rPr>
-      </w:pPr>
-      <w:r>
-        <w:rPr>
-          <w:b/>
-          <w:sz w:val="19"/>
-          <w:szCs w:val="19"/>
-        </w:rPr>
-        <w:t>Response:</w:t>
-      </w:r>
-    </w:p>
-    <w:p>
-      <w:pPr>
-        <w:rPr>
-          <w:b/>
-          <w:sz w:val="19"/>
-          <w:szCs w:val="19"/>
-        </w:rPr>
-      </w:pPr>
-      <w:r>
-        <w:rPr>
-          <w:b/>
-          <w:sz w:val="19"/>
-          <w:szCs w:val="19"/>
-        </w:rPr>
-        <w:t>// If approved</w:t>
-      </w:r>
-      <w:r>
-        <w:rPr>
-          <w:b/>
-          <w:sz w:val="19"/>
-          <w:szCs w:val="19"/>
-        </w:rPr>
-        <w:t xml:space="preserve"> and email not sent</w:t>
-      </w:r>
-    </w:p>
-    <w:p>
-      <w:pPr>
-        <w:shd w:val="clear" w:color="auto" w:fill="FFFFFF"/>
-        <w:spacing w:line="270" w:lineRule="atLeast"/>
-        <w:rPr>
-          <w:rFonts w:ascii="Monaco" w:hAnsi="Monaco"/>
-          <w:color w:val="000000"/>
-          <w:sz w:val="18"/>
-          <w:szCs w:val="18"/>
-        </w:rPr>
-      </w:pPr>
-      <w:r>
-        <w:rPr>
-          <w:rFonts w:ascii="Monaco" w:hAnsi="Monaco"/>
-          <w:color w:val="000000"/>
-          <w:sz w:val="18"/>
-          <w:szCs w:val="18"/>
-        </w:rPr>
-        <w:t>{</w:t>
-      </w:r>
-    </w:p>
-    <w:p>
-      <w:pPr>
-        <w:shd w:val="clear" w:color="auto" w:fill="FFFFFF"/>
-        <w:spacing w:line="270" w:lineRule="atLeast"/>
-        <w:rPr>
-          <w:rFonts w:ascii="Monaco" w:hAnsi="Monaco"/>
-          <w:color w:val="000000"/>
-          <w:sz w:val="18"/>
-          <w:szCs w:val="18"/>
-        </w:rPr>
-      </w:pPr>
-      <w:r>
-        <w:rPr>
-          <w:rFonts w:ascii="Monaco" w:hAnsi="Monaco"/>
-          <w:color w:val="000000"/>
-          <w:sz w:val="18"/>
-          <w:szCs w:val="18"/>
-        </w:rPr>
-        <w:t xml:space="preserve">    </w:t>
-      </w:r>
-      <w:r>
-        <w:rPr>
-          <w:rFonts w:ascii="Monaco" w:hAnsi="Monaco"/>
-          <w:color w:val="A31515"/>
-          <w:sz w:val="18"/>
-          <w:szCs w:val="18"/>
-        </w:rPr>
-        <w:t>"result"</w:t>
-      </w:r>
-      <w:r>
-        <w:rPr>
-          <w:rFonts w:ascii="Monaco" w:hAnsi="Monaco"/>
-          <w:color w:val="000000"/>
-          <w:sz w:val="18"/>
-          <w:szCs w:val="18"/>
-        </w:rPr>
-        <w:t xml:space="preserve">: </w:t>
-      </w:r>
-      <w:r>
-        <w:rPr>
-          <w:rFonts w:ascii="Monaco" w:hAnsi="Monaco"/>
-          <w:color w:val="0451A5"/>
-          <w:sz w:val="18"/>
-          <w:szCs w:val="18"/>
-        </w:rPr>
-        <w:t>"Success"</w:t>
-      </w:r>
-      <w:r>
-        <w:rPr>
-          <w:rFonts w:ascii="Monaco" w:hAnsi="Monaco"/>
-          <w:color w:val="000000"/>
-          <w:sz w:val="18"/>
-          <w:szCs w:val="18"/>
-        </w:rPr>
-        <w:t>,</w:t>
-      </w:r>
-    </w:p>
-    <w:p>
-      <w:pPr>
-        <w:shd w:val="clear" w:color="auto" w:fill="FFFFFF"/>
-        <w:spacing w:line="270" w:lineRule="atLeast"/>
-        <w:rPr>
-          <w:rFonts w:ascii="Monaco" w:hAnsi="Monaco"/>
-          <w:color w:val="000000"/>
-          <w:sz w:val="18"/>
-          <w:szCs w:val="18"/>
-        </w:rPr>
-      </w:pPr>
-      <w:r>
-        <w:rPr>
-          <w:rFonts w:ascii="Monaco" w:hAnsi="Monaco"/>
-          <w:color w:val="000000"/>
-          <w:sz w:val="18"/>
-          <w:szCs w:val="18"/>
-        </w:rPr>
-        <w:t xml:space="preserve">    </w:t>
-      </w:r>
-      <w:r>
-        <w:rPr>
-          <w:rFonts w:ascii="Monaco" w:hAnsi="Monaco"/>
-          <w:color w:val="A31515"/>
-          <w:sz w:val="18"/>
-          <w:szCs w:val="18"/>
-        </w:rPr>
-        <w:t>"Message"</w:t>
-      </w:r>
-      <w:r>
-        <w:rPr>
-          <w:rFonts w:ascii="Monaco" w:hAnsi="Monaco"/>
-          <w:color w:val="000000"/>
-          <w:sz w:val="18"/>
-          <w:szCs w:val="18"/>
-        </w:rPr>
-        <w:t xml:space="preserve">: </w:t>
-      </w:r>
-      <w:r>
-        <w:rPr>
-          <w:rFonts w:ascii="Monaco" w:hAnsi="Monaco"/>
-          <w:color w:val="0451A5"/>
-          <w:sz w:val="18"/>
-          <w:szCs w:val="18"/>
-        </w:rPr>
-        <w:t>"Customer Details Approved Successfully but due to internal server Error Credentials have not been sent to the registered Mail ID."</w:t>
-      </w:r>
-      <w:r>
-        <w:rPr>
-          <w:rFonts w:ascii="Monaco" w:hAnsi="Monaco"/>
-          <w:color w:val="000000"/>
-          <w:sz w:val="18"/>
-          <w:szCs w:val="18"/>
-        </w:rPr>
-        <w:t>,</w:t>
-      </w:r>
-    </w:p>
-    <w:p>
-      <w:pPr>
-        <w:shd w:val="clear" w:color="auto" w:fill="FFFFFF"/>
-        <w:spacing w:line="270" w:lineRule="atLeast"/>
-        <w:rPr>
-          <w:rFonts w:ascii="Monaco" w:hAnsi="Monaco"/>
-          <w:color w:val="000000"/>
-          <w:sz w:val="18"/>
-          <w:szCs w:val="18"/>
-        </w:rPr>
-      </w:pPr>
-      <w:r>
-        <w:rPr>
-          <w:rFonts w:ascii="Monaco" w:hAnsi="Monaco"/>
-          <w:color w:val="000000"/>
-          <w:sz w:val="18"/>
-          <w:szCs w:val="18"/>
-        </w:rPr>
-        <w:t xml:space="preserve">    </w:t>
-      </w:r>
-      <w:r>
-        <w:rPr>
-          <w:rFonts w:ascii="Monaco" w:hAnsi="Monaco"/>
-          <w:color w:val="A31515"/>
-          <w:sz w:val="18"/>
-          <w:szCs w:val="18"/>
-        </w:rPr>
-        <w:t>"</w:t>
-      </w:r>
-      <w:proofErr w:type="spellStart"/>
-      <w:r>
-        <w:rPr>
-          <w:rFonts w:ascii="Monaco" w:hAnsi="Monaco"/>
-          <w:color w:val="A31515"/>
-          <w:sz w:val="18"/>
-          <w:szCs w:val="18"/>
-        </w:rPr>
-        <w:t>transactedByID</w:t>
-      </w:r>
-      <w:proofErr w:type="spellEnd"/>
-      <w:r>
-        <w:rPr>
-          <w:rFonts w:ascii="Monaco" w:hAnsi="Monaco"/>
-          <w:color w:val="A31515"/>
-          <w:sz w:val="18"/>
-          <w:szCs w:val="18"/>
-        </w:rPr>
-        <w:t>"</w:t>
-      </w:r>
-      <w:r>
-        <w:rPr>
-          <w:rFonts w:ascii="Monaco" w:hAnsi="Monaco"/>
-          <w:color w:val="000000"/>
-          <w:sz w:val="18"/>
-          <w:szCs w:val="18"/>
-        </w:rPr>
-        <w:t xml:space="preserve">: </w:t>
-      </w:r>
-      <w:r>
-        <w:rPr>
-          <w:rFonts w:ascii="Monaco" w:hAnsi="Monaco"/>
-          <w:color w:val="098658"/>
-          <w:sz w:val="18"/>
-          <w:szCs w:val="18"/>
-        </w:rPr>
-        <w:t>0</w:t>
-      </w:r>
-      <w:r>
-        <w:rPr>
-          <w:rFonts w:ascii="Monaco" w:hAnsi="Monaco"/>
-          <w:color w:val="000000"/>
-          <w:sz w:val="18"/>
-          <w:szCs w:val="18"/>
-        </w:rPr>
-        <w:t>,</w:t>
-      </w:r>
-    </w:p>
-    <w:p>
-      <w:pPr>
-        <w:shd w:val="clear" w:color="auto" w:fill="FFFFFF"/>
-        <w:spacing w:line="270" w:lineRule="atLeast"/>
-        <w:rPr>
-          <w:rFonts w:ascii="Monaco" w:hAnsi="Monaco"/>
-          <w:color w:val="000000"/>
-          <w:sz w:val="18"/>
-          <w:szCs w:val="18"/>
-        </w:rPr>
-      </w:pPr>
-      <w:r>
-        <w:rPr>
-          <w:rFonts w:ascii="Monaco" w:hAnsi="Monaco"/>
-          <w:color w:val="000000"/>
-          <w:sz w:val="18"/>
-          <w:szCs w:val="18"/>
-        </w:rPr>
-        <w:t xml:space="preserve">    </w:t>
-      </w:r>
-      <w:r>
-        <w:rPr>
-          <w:rFonts w:ascii="Monaco" w:hAnsi="Monaco"/>
-          <w:color w:val="A31515"/>
-          <w:sz w:val="18"/>
-          <w:szCs w:val="18"/>
-        </w:rPr>
-        <w:t>"</w:t>
-      </w:r>
-      <w:proofErr w:type="spellStart"/>
-      <w:r>
-        <w:rPr>
-          <w:rFonts w:ascii="Monaco" w:hAnsi="Monaco"/>
-          <w:color w:val="A31515"/>
-          <w:sz w:val="18"/>
-          <w:szCs w:val="18"/>
-        </w:rPr>
-        <w:t>transactionID</w:t>
-      </w:r>
-      <w:proofErr w:type="spellEnd"/>
-      <w:r>
-        <w:rPr>
-          <w:rFonts w:ascii="Monaco" w:hAnsi="Monaco"/>
-          <w:color w:val="A31515"/>
-          <w:sz w:val="18"/>
-          <w:szCs w:val="18"/>
-        </w:rPr>
-        <w:t>"</w:t>
-      </w:r>
-      <w:r>
-        <w:rPr>
-          <w:rFonts w:ascii="Monaco" w:hAnsi="Monaco"/>
-          <w:color w:val="000000"/>
-          <w:sz w:val="18"/>
-          <w:szCs w:val="18"/>
-        </w:rPr>
-        <w:t xml:space="preserve">: </w:t>
-      </w:r>
-      <w:r>
-        <w:rPr>
-          <w:rFonts w:ascii="Monaco" w:hAnsi="Monaco"/>
-          <w:color w:val="098658"/>
-          <w:sz w:val="18"/>
-          <w:szCs w:val="18"/>
-        </w:rPr>
-        <w:t>0</w:t>
-      </w:r>
-    </w:p>
-    <w:p>
-      <w:pPr>
-        <w:shd w:val="clear" w:color="auto" w:fill="FFFFFF"/>
-        <w:spacing w:line="270" w:lineRule="atLeast"/>
-        <w:rPr>
-          <w:rFonts w:ascii="Monaco" w:hAnsi="Monaco"/>
-          <w:color w:val="000000"/>
-          <w:sz w:val="18"/>
-          <w:szCs w:val="18"/>
-        </w:rPr>
-      </w:pPr>
-      <w:r>
-        <w:rPr>
-          <w:rFonts w:ascii="Monaco" w:hAnsi="Monaco"/>
-          <w:color w:val="000000"/>
-          <w:sz w:val="18"/>
-          <w:szCs w:val="18"/>
-        </w:rPr>
-        <w:t>}</w:t>
-      </w:r>
-    </w:p>
-    <w:p>
-      <w:pPr>
-        <w:rPr>
-          <w:b/>
-          <w:sz w:val="19"/>
-          <w:szCs w:val="19"/>
-        </w:rPr>
-      </w:pPr>
-      <w:r>
-        <w:rPr>
-          <w:b/>
-          <w:sz w:val="19"/>
-          <w:szCs w:val="19"/>
-        </w:rPr>
-        <w:t xml:space="preserve"> </w:t>
-      </w:r>
-    </w:p>
-    <w:p>
-      <w:pPr>
-        <w:rPr>
-          <w:b/>
-          <w:sz w:val="19"/>
-          <w:szCs w:val="19"/>
-        </w:rPr>
-      </w:pPr>
-      <w:r>
-        <w:rPr>
-          <w:b/>
-          <w:sz w:val="19"/>
-          <w:szCs w:val="19"/>
-        </w:rPr>
-        <w:t>// If approved and email sent</w:t>
-      </w:r>
-    </w:p>
-    <w:p>
-      <w:pPr>
-        <w:shd w:val="clear" w:color="auto" w:fill="FFFFFF"/>
-        <w:spacing w:line="270" w:lineRule="atLeast"/>
-        <w:rPr>
-          <w:rFonts w:ascii="Monaco" w:hAnsi="Monaco"/>
-          <w:color w:val="000000"/>
-          <w:sz w:val="18"/>
-          <w:szCs w:val="18"/>
-        </w:rPr>
-      </w:pPr>
-      <w:r>
-        <w:rPr>
-          <w:rFonts w:ascii="Monaco" w:hAnsi="Monaco"/>
-          <w:color w:val="000000"/>
-          <w:sz w:val="18"/>
-          <w:szCs w:val="18"/>
-        </w:rPr>
-        <w:t>{</w:t>
-      </w:r>
-    </w:p>
-    <w:p>
-      <w:pPr>
-        <w:shd w:val="clear" w:color="auto" w:fill="FFFFFF"/>
-        <w:spacing w:line="270" w:lineRule="atLeast"/>
-        <w:rPr>
-          <w:rFonts w:ascii="Monaco" w:hAnsi="Monaco"/>
-          <w:color w:val="000000"/>
-          <w:sz w:val="18"/>
-          <w:szCs w:val="18"/>
-        </w:rPr>
-      </w:pPr>
-      <w:r>
-        <w:rPr>
-          <w:rFonts w:ascii="Monaco" w:hAnsi="Monaco"/>
-          <w:color w:val="000000"/>
-          <w:sz w:val="18"/>
-          <w:szCs w:val="18"/>
-        </w:rPr>
-        <w:t xml:space="preserve">    </w:t>
-      </w:r>
-      <w:r>
-        <w:rPr>
-          <w:rFonts w:ascii="Monaco" w:hAnsi="Monaco"/>
-          <w:color w:val="A31515"/>
-          <w:sz w:val="18"/>
-          <w:szCs w:val="18"/>
-        </w:rPr>
-        <w:t>"result"</w:t>
-      </w:r>
-      <w:r>
-        <w:rPr>
-          <w:rFonts w:ascii="Monaco" w:hAnsi="Monaco"/>
-          <w:color w:val="000000"/>
-          <w:sz w:val="18"/>
-          <w:szCs w:val="18"/>
-        </w:rPr>
-        <w:t xml:space="preserve">: </w:t>
-      </w:r>
-      <w:r>
-        <w:rPr>
-          <w:rFonts w:ascii="Monaco" w:hAnsi="Monaco"/>
-          <w:color w:val="0451A5"/>
-          <w:sz w:val="18"/>
-          <w:szCs w:val="18"/>
-        </w:rPr>
-        <w:t>"Success"</w:t>
-      </w:r>
-      <w:r>
-        <w:rPr>
-          <w:rFonts w:ascii="Monaco" w:hAnsi="Monaco"/>
-          <w:color w:val="000000"/>
-          <w:sz w:val="18"/>
-          <w:szCs w:val="18"/>
-        </w:rPr>
-        <w:t>,</w:t>
-      </w:r>
-    </w:p>
-    <w:p>
-      <w:pPr>
-        <w:shd w:val="clear" w:color="auto" w:fill="FFFFFF"/>
-        <w:spacing w:line="270" w:lineRule="atLeast"/>
-        <w:rPr>
-          <w:rFonts w:ascii="Monaco" w:hAnsi="Monaco"/>
-          <w:color w:val="000000"/>
-          <w:sz w:val="18"/>
-          <w:szCs w:val="18"/>
-        </w:rPr>
-      </w:pPr>
-      <w:r>
-        <w:rPr>
-          <w:rFonts w:ascii="Monaco" w:hAnsi="Monaco"/>
-          <w:color w:val="000000"/>
-          <w:sz w:val="18"/>
-          <w:szCs w:val="18"/>
-        </w:rPr>
-        <w:t xml:space="preserve">    </w:t>
-      </w:r>
-      <w:r>
-        <w:rPr>
-          <w:rFonts w:ascii="Monaco" w:hAnsi="Monaco"/>
-          <w:color w:val="A31515"/>
-          <w:sz w:val="18"/>
-          <w:szCs w:val="18"/>
-        </w:rPr>
-        <w:t>"Message"</w:t>
-      </w:r>
-      <w:r>
-        <w:rPr>
-          <w:rFonts w:ascii="Monaco" w:hAnsi="Monaco"/>
-          <w:color w:val="000000"/>
-          <w:sz w:val="18"/>
-          <w:szCs w:val="18"/>
-        </w:rPr>
-        <w:t xml:space="preserve">: </w:t>
-      </w:r>
-      <w:r>
-        <w:rPr>
-          <w:rFonts w:ascii="Monaco" w:hAnsi="Monaco"/>
-          <w:color w:val="0451A5"/>
-          <w:sz w:val="18"/>
-          <w:szCs w:val="18"/>
-        </w:rPr>
-        <w:t>"</w:t>
-      </w:r>
-      <w:r>
-        <w:rPr>
-          <w:rFonts w:ascii="Monaco" w:hAnsi="Monaco"/>
-          <w:color w:val="0451A5"/>
-          <w:sz w:val="18"/>
-          <w:szCs w:val="18"/>
-          <w:lang w:val="en-GB"/>
-        </w:rPr>
-        <w:t>Customer Details Approved Successfully and an email with login credentials have been sent to the customer updated email id</w:t>
-      </w:r>
-      <w:r>
-        <w:rPr>
-          <w:rFonts w:ascii="Monaco" w:hAnsi="Monaco"/>
-          <w:color w:val="0451A5"/>
-          <w:sz w:val="18"/>
-          <w:szCs w:val="18"/>
-        </w:rPr>
-        <w:t>"</w:t>
-      </w:r>
-      <w:r>
-        <w:rPr>
-          <w:rFonts w:ascii="Monaco" w:hAnsi="Monaco"/>
-          <w:color w:val="000000"/>
-          <w:sz w:val="18"/>
-          <w:szCs w:val="18"/>
-        </w:rPr>
-        <w:t>,</w:t>
-      </w:r>
-    </w:p>
-    <w:p>
-      <w:pPr>
-        <w:shd w:val="clear" w:color="auto" w:fill="FFFFFF"/>
-        <w:spacing w:line="270" w:lineRule="atLeast"/>
-        <w:rPr>
-          <w:rFonts w:ascii="Monaco" w:hAnsi="Monaco"/>
-          <w:color w:val="000000"/>
-          <w:sz w:val="18"/>
-          <w:szCs w:val="18"/>
-        </w:rPr>
-      </w:pPr>
-      <w:r>
-        <w:rPr>
-          <w:rFonts w:ascii="Monaco" w:hAnsi="Monaco"/>
-          <w:color w:val="000000"/>
-          <w:sz w:val="18"/>
-          <w:szCs w:val="18"/>
-        </w:rPr>
-        <w:t xml:space="preserve">    </w:t>
-      </w:r>
-      <w:r>
-        <w:rPr>
-          <w:rFonts w:ascii="Monaco" w:hAnsi="Monaco"/>
-          <w:color w:val="A31515"/>
-          <w:sz w:val="18"/>
-          <w:szCs w:val="18"/>
-        </w:rPr>
-        <w:t>"</w:t>
-      </w:r>
-      <w:proofErr w:type="spellStart"/>
-      <w:r>
-        <w:rPr>
-          <w:rFonts w:ascii="Monaco" w:hAnsi="Monaco"/>
-          <w:color w:val="A31515"/>
-          <w:sz w:val="18"/>
-          <w:szCs w:val="18"/>
-        </w:rPr>
-        <w:t>transactedByID</w:t>
-      </w:r>
-      <w:proofErr w:type="spellEnd"/>
-      <w:r>
-        <w:rPr>
-          <w:rFonts w:ascii="Monaco" w:hAnsi="Monaco"/>
-          <w:color w:val="A31515"/>
-          <w:sz w:val="18"/>
-          <w:szCs w:val="18"/>
-        </w:rPr>
-        <w:t>"</w:t>
-      </w:r>
-      <w:r>
-        <w:rPr>
-          <w:rFonts w:ascii="Monaco" w:hAnsi="Monaco"/>
-          <w:color w:val="000000"/>
-          <w:sz w:val="18"/>
-          <w:szCs w:val="18"/>
-        </w:rPr>
-        <w:t xml:space="preserve">: </w:t>
-      </w:r>
-      <w:r>
-        <w:rPr>
-          <w:rFonts w:ascii="Monaco" w:hAnsi="Monaco"/>
-          <w:color w:val="098658"/>
-          <w:sz w:val="18"/>
-          <w:szCs w:val="18"/>
-        </w:rPr>
-        <w:t>0</w:t>
-      </w:r>
-      <w:r>
-        <w:rPr>
-          <w:rFonts w:ascii="Monaco" w:hAnsi="Monaco"/>
-          <w:color w:val="000000"/>
-          <w:sz w:val="18"/>
-          <w:szCs w:val="18"/>
-        </w:rPr>
-        <w:t>,</w:t>
-      </w:r>
-    </w:p>
-    <w:p>
-      <w:pPr>
-        <w:shd w:val="clear" w:color="auto" w:fill="FFFFFF"/>
-        <w:spacing w:line="270" w:lineRule="atLeast"/>
-        <w:rPr>
-          <w:rFonts w:ascii="Monaco" w:hAnsi="Monaco"/>
-          <w:color w:val="000000"/>
-          <w:sz w:val="18"/>
-          <w:szCs w:val="18"/>
-        </w:rPr>
-      </w:pPr>
-      <w:r>
-        <w:rPr>
-          <w:rFonts w:ascii="Monaco" w:hAnsi="Monaco"/>
-          <w:color w:val="000000"/>
-          <w:sz w:val="18"/>
-          <w:szCs w:val="18"/>
-        </w:rPr>
-        <w:t xml:space="preserve">    </w:t>
-      </w:r>
-      <w:r>
-        <w:rPr>
-          <w:rFonts w:ascii="Monaco" w:hAnsi="Monaco"/>
-          <w:color w:val="A31515"/>
-          <w:sz w:val="18"/>
-          <w:szCs w:val="18"/>
-        </w:rPr>
-        <w:t>"</w:t>
-      </w:r>
-      <w:proofErr w:type="spellStart"/>
-      <w:r>
-        <w:rPr>
-          <w:rFonts w:ascii="Monaco" w:hAnsi="Monaco"/>
-          <w:color w:val="A31515"/>
-          <w:sz w:val="18"/>
-          <w:szCs w:val="18"/>
-        </w:rPr>
-        <w:t>transactionID</w:t>
-      </w:r>
-      <w:proofErr w:type="spellEnd"/>
-      <w:r>
-        <w:rPr>
-          <w:rFonts w:ascii="Monaco" w:hAnsi="Monaco"/>
-          <w:color w:val="A31515"/>
-          <w:sz w:val="18"/>
-          <w:szCs w:val="18"/>
-        </w:rPr>
-        <w:t>"</w:t>
-      </w:r>
-      <w:r>
-        <w:rPr>
-          <w:rFonts w:ascii="Monaco" w:hAnsi="Monaco"/>
-          <w:color w:val="000000"/>
-          <w:sz w:val="18"/>
-          <w:szCs w:val="18"/>
-        </w:rPr>
-        <w:t xml:space="preserve">: </w:t>
-      </w:r>
-      <w:r>
-        <w:rPr>
-          <w:rFonts w:ascii="Monaco" w:hAnsi="Monaco"/>
-          <w:color w:val="098658"/>
-          <w:sz w:val="18"/>
-          <w:szCs w:val="18"/>
-        </w:rPr>
-        <w:t>0</w:t>
-      </w:r>
-    </w:p>
-    <w:p>
-      <w:pPr>
-        <w:shd w:val="clear" w:color="auto" w:fill="FFFFFF"/>
-        <w:spacing w:line="270" w:lineRule="atLeast"/>
-        <w:rPr>
-          <w:rFonts w:ascii="Monaco" w:hAnsi="Monaco"/>
-          <w:color w:val="000000"/>
-          <w:sz w:val="18"/>
-          <w:szCs w:val="18"/>
-        </w:rPr>
-      </w:pPr>
-      <w:r>
-        <w:rPr>
-          <w:rFonts w:ascii="Monaco" w:hAnsi="Monaco"/>
-          <w:color w:val="000000"/>
-          <w:sz w:val="18"/>
-          <w:szCs w:val="18"/>
-        </w:rPr>
-        <w:t>}</w:t>
-      </w:r>
     </w:p>
     <w:p>
       <w:pPr>
@@ -18208,7 +18606,8 @@
           <w:szCs w:val="26"/>
           <w:u w:val="single"/>
         </w:rPr>
-        <w:t>12</w:t>
+        <w:lastRenderedPageBreak/>
+        <w:t>1</w:t>
       </w:r>
       <w:r>
         <w:rPr>
@@ -18217,6 +18616,15 @@
           <w:szCs w:val="26"/>
           <w:u w:val="single"/>
         </w:rPr>
+        <w:t>1</w:t>
+      </w:r>
+      <w:r>
+        <w:rPr>
+          <w:b/>
+          <w:sz w:val="26"/>
+          <w:szCs w:val="26"/>
+          <w:u w:val="single"/>
+        </w:rPr>
         <w:t>. Dropdowns</w:t>
       </w:r>
     </w:p>
@@ -18483,7 +18891,6 @@
           <w:sz w:val="18"/>
           <w:szCs w:val="18"/>
         </w:rPr>
-        <w:lastRenderedPageBreak/>
         <w:t xml:space="preserve">    },</w:t>
       </w:r>
     </w:p>
@@ -18846,7 +19253,21 @@
           <w:sz w:val="20"/>
           <w:szCs w:val="20"/>
         </w:rPr>
-        <w:t>Map received in response of API No. 12a)</w:t>
+        <w:t>Map received in response of API No. 1</w:t>
+      </w:r>
+      <w:r>
+        <w:rPr>
+          <w:sz w:val="20"/>
+          <w:szCs w:val="20"/>
+        </w:rPr>
+        <w:t>1</w:t>
+      </w:r>
+      <w:r>
+        <w:rPr>
+          <w:sz w:val="20"/>
+          <w:szCs w:val="20"/>
+        </w:rPr>
+        <w:t>a)</w:t>
       </w:r>
     </w:p>
     <w:p>
@@ -19367,23 +19788,35 @@
           <w:sz w:val="20"/>
           <w:szCs w:val="20"/>
         </w:rPr>
-        <w:t xml:space="preserve">c. to retrieve list of </w:t>
-      </w:r>
-      <w:proofErr w:type="spellStart"/>
-      <w:r>
-        <w:rPr>
-          <w:sz w:val="20"/>
-          <w:szCs w:val="20"/>
-        </w:rPr>
-        <w:t>HouseNos</w:t>
-      </w:r>
-      <w:proofErr w:type="spellEnd"/>
-      <w:r>
-        <w:rPr>
-          <w:sz w:val="20"/>
-          <w:szCs w:val="20"/>
-        </w:rPr>
-        <w:t>/Customers of a particular Block</w:t>
+        <w:t>c. to retrieve list of House</w:t>
+      </w:r>
+      <w:r>
+        <w:rPr>
+          <w:sz w:val="20"/>
+          <w:szCs w:val="20"/>
+        </w:rPr>
+        <w:t xml:space="preserve"> </w:t>
+      </w:r>
+      <w:r>
+        <w:rPr>
+          <w:sz w:val="20"/>
+          <w:szCs w:val="20"/>
+        </w:rPr>
+        <w:t>Nos</w:t>
+      </w:r>
+      <w:r>
+        <w:rPr>
+          <w:sz w:val="20"/>
+          <w:szCs w:val="20"/>
+        </w:rPr>
+        <w:t xml:space="preserve"> </w:t>
+      </w:r>
+      <w:r>
+        <w:rPr>
+          <w:sz w:val="20"/>
+          <w:szCs w:val="20"/>
+        </w:rPr>
+        <w:t>of a particular Block</w:t>
       </w:r>
     </w:p>
     <w:p>
@@ -19416,7 +19849,21 @@
           <w:sz w:val="20"/>
           <w:szCs w:val="20"/>
         </w:rPr>
-        <w:t xml:space="preserve"> common URL/customers/</w:t>
+        <w:t xml:space="preserve"> common URL/</w:t>
+      </w:r>
+      <w:r>
+        <w:rPr>
+          <w:sz w:val="20"/>
+          <w:szCs w:val="20"/>
+        </w:rPr>
+        <w:t>houses</w:t>
+      </w:r>
+      <w:r>
+        <w:rPr>
+          <w:sz w:val="20"/>
+          <w:szCs w:val="20"/>
+        </w:rPr>
+        <w:t>/</w:t>
       </w:r>
       <w:r>
         <w:rPr>
@@ -19533,15 +19980,43 @@
           <w:sz w:val="20"/>
           <w:szCs w:val="20"/>
         </w:rPr>
-        <w:t>communityID</w:t>
-      </w:r>
-      <w:proofErr w:type="spellEnd"/>
-      <w:r>
-        <w:rPr>
-          <w:sz w:val="20"/>
-          <w:szCs w:val="20"/>
-        </w:rPr>
-        <w:t xml:space="preserve"> is the previously selected community id from the community dropdown(</w:t>
+        <w:t>blockID</w:t>
+      </w:r>
+      <w:proofErr w:type="spellEnd"/>
+      <w:r>
+        <w:rPr>
+          <w:sz w:val="20"/>
+          <w:szCs w:val="20"/>
+        </w:rPr>
+        <w:t xml:space="preserve"> is the previously selected </w:t>
+      </w:r>
+      <w:r>
+        <w:rPr>
+          <w:sz w:val="20"/>
+          <w:szCs w:val="20"/>
+        </w:rPr>
+        <w:t>block</w:t>
+      </w:r>
+      <w:r>
+        <w:rPr>
+          <w:sz w:val="20"/>
+          <w:szCs w:val="20"/>
+        </w:rPr>
+        <w:t xml:space="preserve"> id from the </w:t>
+      </w:r>
+      <w:r>
+        <w:rPr>
+          <w:sz w:val="20"/>
+          <w:szCs w:val="20"/>
+        </w:rPr>
+        <w:t>block</w:t>
+      </w:r>
+      <w:r>
+        <w:rPr>
+          <w:sz w:val="20"/>
+          <w:szCs w:val="20"/>
+        </w:rPr>
+        <w:t xml:space="preserve"> dropdown(</w:t>
       </w:r>
       <w:proofErr w:type="spellStart"/>
       <w:r>
@@ -19567,7 +20042,7 @@
           <w:sz w:val="18"/>
           <w:szCs w:val="18"/>
         </w:rPr>
-        <w:t>dropDownCommunities</w:t>
+        <w:t>dropDownBlocks</w:t>
       </w:r>
       <w:proofErr w:type="spellEnd"/>
       <w:r>
@@ -19582,840 +20057,684 @@
           <w:sz w:val="20"/>
           <w:szCs w:val="20"/>
         </w:rPr>
-        <w:t>Map received in response of API No. 12a)</w:t>
-      </w:r>
-    </w:p>
-    <w:p>
-      <w:pPr>
-        <w:rPr>
-          <w:sz w:val="20"/>
-          <w:szCs w:val="20"/>
-        </w:rPr>
-      </w:pPr>
-      <w:r>
-        <w:rPr>
+        <w:t>Map received in response of API No. 1</w:t>
+      </w:r>
+      <w:r>
+        <w:rPr>
+          <w:sz w:val="20"/>
+          <w:szCs w:val="20"/>
+        </w:rPr>
+        <w:t>1</w:t>
+      </w:r>
+      <w:r>
+        <w:rPr>
+          <w:sz w:val="20"/>
+          <w:szCs w:val="20"/>
+        </w:rPr>
+        <w:t>b)</w:t>
+      </w:r>
+    </w:p>
+    <w:p>
+      <w:pPr>
+        <w:rPr>
+          <w:sz w:val="20"/>
+          <w:szCs w:val="20"/>
+        </w:rPr>
+      </w:pPr>
+    </w:p>
+    <w:p>
+      <w:pPr>
+        <w:rPr>
+          <w:b/>
+          <w:sz w:val="20"/>
+          <w:szCs w:val="20"/>
+        </w:rPr>
+      </w:pPr>
+      <w:r>
+        <w:rPr>
+          <w:b/>
+          <w:sz w:val="20"/>
+          <w:szCs w:val="20"/>
+        </w:rPr>
+        <w:t xml:space="preserve">Response: </w:t>
+      </w:r>
+    </w:p>
+    <w:p>
+      <w:pPr>
+        <w:shd w:val="clear" w:color="auto" w:fill="FFFFFF"/>
+        <w:spacing w:line="270" w:lineRule="atLeast"/>
+        <w:rPr>
+          <w:rFonts w:ascii="Monaco" w:hAnsi="Monaco"/>
+          <w:color w:val="000000"/>
+          <w:sz w:val="18"/>
+          <w:szCs w:val="18"/>
+        </w:rPr>
+      </w:pPr>
+      <w:r>
+        <w:rPr>
+          <w:rFonts w:ascii="Monaco" w:hAnsi="Monaco"/>
+          <w:color w:val="000000"/>
+          <w:sz w:val="18"/>
+          <w:szCs w:val="18"/>
+        </w:rPr>
+        <w:t>{</w:t>
+      </w:r>
+    </w:p>
+    <w:p>
+      <w:pPr>
+        <w:shd w:val="clear" w:color="auto" w:fill="FFFFFF"/>
+        <w:spacing w:line="270" w:lineRule="atLeast"/>
+        <w:rPr>
+          <w:rFonts w:ascii="Monaco" w:hAnsi="Monaco"/>
+          <w:color w:val="000000"/>
+          <w:sz w:val="18"/>
+          <w:szCs w:val="18"/>
+        </w:rPr>
+      </w:pPr>
+      <w:r>
+        <w:rPr>
+          <w:rFonts w:ascii="Monaco" w:hAnsi="Monaco"/>
+          <w:color w:val="000000"/>
+          <w:sz w:val="18"/>
+          <w:szCs w:val="18"/>
+        </w:rPr>
+        <w:t xml:space="preserve">    </w:t>
+      </w:r>
+      <w:r>
+        <w:rPr>
+          <w:rFonts w:ascii="Monaco" w:hAnsi="Monaco"/>
+          <w:color w:val="A31515"/>
+          <w:sz w:val="18"/>
+          <w:szCs w:val="18"/>
+        </w:rPr>
+        <w:t>"</w:t>
+      </w:r>
+      <w:proofErr w:type="spellStart"/>
+      <w:r>
+        <w:rPr>
+          <w:rFonts w:ascii="Monaco" w:hAnsi="Monaco"/>
+          <w:color w:val="A31515"/>
+          <w:sz w:val="18"/>
+          <w:szCs w:val="18"/>
+        </w:rPr>
+        <w:t>dropDownCustomers</w:t>
+      </w:r>
+      <w:proofErr w:type="spellEnd"/>
+      <w:r>
+        <w:rPr>
+          <w:rFonts w:ascii="Monaco" w:hAnsi="Monaco"/>
+          <w:color w:val="A31515"/>
+          <w:sz w:val="18"/>
+          <w:szCs w:val="18"/>
+        </w:rPr>
+        <w:t>"</w:t>
+      </w:r>
+      <w:r>
+        <w:rPr>
+          <w:rFonts w:ascii="Monaco" w:hAnsi="Monaco"/>
+          <w:color w:val="000000"/>
+          <w:sz w:val="18"/>
+          <w:szCs w:val="18"/>
+        </w:rPr>
+        <w:t>: {</w:t>
+      </w:r>
+    </w:p>
+    <w:p>
+      <w:pPr>
+        <w:shd w:val="clear" w:color="auto" w:fill="FFFFFF"/>
+        <w:spacing w:line="270" w:lineRule="atLeast"/>
+        <w:rPr>
+          <w:rFonts w:ascii="Monaco" w:hAnsi="Monaco"/>
+          <w:color w:val="000000"/>
+          <w:sz w:val="18"/>
+          <w:szCs w:val="18"/>
+        </w:rPr>
+      </w:pPr>
+      <w:r>
+        <w:rPr>
+          <w:rFonts w:ascii="Monaco" w:hAnsi="Monaco"/>
+          <w:color w:val="000000"/>
+          <w:sz w:val="18"/>
+          <w:szCs w:val="18"/>
+        </w:rPr>
+        <w:t xml:space="preserve">        </w:t>
+      </w:r>
+      <w:r>
+        <w:rPr>
+          <w:rFonts w:ascii="Monaco" w:hAnsi="Monaco"/>
+          <w:color w:val="A31515"/>
+          <w:sz w:val="18"/>
+          <w:szCs w:val="18"/>
+        </w:rPr>
+        <w:t>"512"</w:t>
+      </w:r>
+      <w:r>
+        <w:rPr>
+          <w:rFonts w:ascii="Monaco" w:hAnsi="Monaco"/>
+          <w:color w:val="000000"/>
+          <w:sz w:val="18"/>
+          <w:szCs w:val="18"/>
+        </w:rPr>
+        <w:t xml:space="preserve">: </w:t>
+      </w:r>
+      <w:r>
+        <w:rPr>
+          <w:rFonts w:ascii="Monaco" w:hAnsi="Monaco"/>
+          <w:color w:val="0451A5"/>
+          <w:sz w:val="18"/>
+          <w:szCs w:val="18"/>
+        </w:rPr>
+        <w:t>"villa-96"</w:t>
+      </w:r>
+      <w:r>
+        <w:rPr>
+          <w:rFonts w:ascii="Monaco" w:hAnsi="Monaco"/>
+          <w:color w:val="000000"/>
+          <w:sz w:val="18"/>
+          <w:szCs w:val="18"/>
+        </w:rPr>
+        <w:t>,</w:t>
+      </w:r>
+    </w:p>
+    <w:p>
+      <w:pPr>
+        <w:shd w:val="clear" w:color="auto" w:fill="FFFFFF"/>
+        <w:spacing w:line="270" w:lineRule="atLeast"/>
+        <w:rPr>
+          <w:rFonts w:ascii="Monaco" w:hAnsi="Monaco"/>
+          <w:color w:val="000000"/>
+          <w:sz w:val="18"/>
+          <w:szCs w:val="18"/>
+        </w:rPr>
+      </w:pPr>
+      <w:r>
+        <w:rPr>
+          <w:rFonts w:ascii="Monaco" w:hAnsi="Monaco"/>
+          <w:color w:val="000000"/>
+          <w:sz w:val="18"/>
+          <w:szCs w:val="18"/>
+        </w:rPr>
+        <w:t xml:space="preserve">        </w:t>
+      </w:r>
+      <w:r>
+        <w:rPr>
+          <w:rFonts w:ascii="Monaco" w:hAnsi="Monaco"/>
+          <w:color w:val="A31515"/>
+          <w:sz w:val="18"/>
+          <w:szCs w:val="18"/>
+        </w:rPr>
+        <w:t>"513"</w:t>
+      </w:r>
+      <w:r>
+        <w:rPr>
+          <w:rFonts w:ascii="Monaco" w:hAnsi="Monaco"/>
+          <w:color w:val="000000"/>
+          <w:sz w:val="18"/>
+          <w:szCs w:val="18"/>
+        </w:rPr>
+        <w:t xml:space="preserve">: </w:t>
+      </w:r>
+      <w:r>
+        <w:rPr>
+          <w:rFonts w:ascii="Monaco" w:hAnsi="Monaco"/>
+          <w:color w:val="0451A5"/>
+          <w:sz w:val="18"/>
+          <w:szCs w:val="18"/>
+        </w:rPr>
+        <w:t>"villa-98"</w:t>
+      </w:r>
+      <w:r>
+        <w:rPr>
+          <w:rFonts w:ascii="Monaco" w:hAnsi="Monaco"/>
+          <w:color w:val="000000"/>
+          <w:sz w:val="18"/>
+          <w:szCs w:val="18"/>
+        </w:rPr>
+        <w:t>,</w:t>
+      </w:r>
+    </w:p>
+    <w:p>
+      <w:pPr>
+        <w:shd w:val="clear" w:color="auto" w:fill="FFFFFF"/>
+        <w:spacing w:line="270" w:lineRule="atLeast"/>
+        <w:rPr>
+          <w:rFonts w:ascii="Monaco" w:hAnsi="Monaco"/>
+          <w:color w:val="000000"/>
+          <w:sz w:val="18"/>
+          <w:szCs w:val="18"/>
+        </w:rPr>
+      </w:pPr>
+      <w:r>
+        <w:rPr>
+          <w:rFonts w:ascii="Monaco" w:hAnsi="Monaco"/>
+          <w:color w:val="000000"/>
+          <w:sz w:val="18"/>
+          <w:szCs w:val="18"/>
+        </w:rPr>
+        <w:t xml:space="preserve">        </w:t>
+      </w:r>
+      <w:r>
+        <w:rPr>
+          <w:rFonts w:ascii="Monaco" w:hAnsi="Monaco"/>
+          <w:color w:val="A31515"/>
+          <w:sz w:val="18"/>
+          <w:szCs w:val="18"/>
+        </w:rPr>
+        <w:t>"2"</w:t>
+      </w:r>
+      <w:r>
+        <w:rPr>
+          <w:rFonts w:ascii="Monaco" w:hAnsi="Monaco"/>
+          <w:color w:val="000000"/>
+          <w:sz w:val="18"/>
+          <w:szCs w:val="18"/>
+        </w:rPr>
+        <w:t xml:space="preserve">: </w:t>
+      </w:r>
+      <w:r>
+        <w:rPr>
+          <w:rFonts w:ascii="Monaco" w:hAnsi="Monaco"/>
+          <w:color w:val="0451A5"/>
+          <w:sz w:val="18"/>
+          <w:szCs w:val="18"/>
+        </w:rPr>
+        <w:t>"Villa-22"</w:t>
+      </w:r>
+      <w:r>
+        <w:rPr>
+          <w:rFonts w:ascii="Monaco" w:hAnsi="Monaco"/>
+          <w:color w:val="000000"/>
+          <w:sz w:val="18"/>
+          <w:szCs w:val="18"/>
+        </w:rPr>
+        <w:t>,</w:t>
+      </w:r>
+    </w:p>
+    <w:p>
+      <w:pPr>
+        <w:shd w:val="clear" w:color="auto" w:fill="FFFFFF"/>
+        <w:spacing w:line="270" w:lineRule="atLeast"/>
+        <w:rPr>
+          <w:rFonts w:ascii="Monaco" w:hAnsi="Monaco"/>
+          <w:color w:val="000000"/>
+          <w:sz w:val="18"/>
+          <w:szCs w:val="18"/>
+        </w:rPr>
+      </w:pPr>
+      <w:r>
+        <w:rPr>
+          <w:rFonts w:ascii="Monaco" w:hAnsi="Monaco"/>
+          <w:color w:val="000000"/>
+          <w:sz w:val="18"/>
+          <w:szCs w:val="18"/>
+        </w:rPr>
+        <w:t xml:space="preserve">        </w:t>
+      </w:r>
+      <w:r>
+        <w:rPr>
+          <w:rFonts w:ascii="Monaco" w:hAnsi="Monaco"/>
+          <w:color w:val="A31515"/>
+          <w:sz w:val="18"/>
+          <w:szCs w:val="18"/>
+        </w:rPr>
+        <w:t>"514"</w:t>
+      </w:r>
+      <w:r>
+        <w:rPr>
+          <w:rFonts w:ascii="Monaco" w:hAnsi="Monaco"/>
+          <w:color w:val="000000"/>
+          <w:sz w:val="18"/>
+          <w:szCs w:val="18"/>
+        </w:rPr>
+        <w:t xml:space="preserve">: </w:t>
+      </w:r>
+      <w:r>
+        <w:rPr>
+          <w:rFonts w:ascii="Monaco" w:hAnsi="Monaco"/>
+          <w:color w:val="0451A5"/>
+          <w:sz w:val="18"/>
+          <w:szCs w:val="18"/>
+        </w:rPr>
+        <w:t>"villa-103"</w:t>
+      </w:r>
+      <w:r>
+        <w:rPr>
+          <w:rFonts w:ascii="Monaco" w:hAnsi="Monaco"/>
+          <w:color w:val="000000"/>
+          <w:sz w:val="18"/>
+          <w:szCs w:val="18"/>
+        </w:rPr>
+        <w:t>,</w:t>
+      </w:r>
+    </w:p>
+    <w:p>
+      <w:pPr>
+        <w:shd w:val="clear" w:color="auto" w:fill="FFFFFF"/>
+        <w:spacing w:line="270" w:lineRule="atLeast"/>
+        <w:rPr>
+          <w:rFonts w:ascii="Monaco" w:hAnsi="Monaco"/>
+          <w:color w:val="000000"/>
+          <w:sz w:val="18"/>
+          <w:szCs w:val="18"/>
+        </w:rPr>
+      </w:pPr>
+      <w:r>
+        <w:rPr>
+          <w:rFonts w:ascii="Monaco" w:hAnsi="Monaco"/>
+          <w:color w:val="000000"/>
+          <w:sz w:val="18"/>
+          <w:szCs w:val="18"/>
+        </w:rPr>
+        <w:t xml:space="preserve">        </w:t>
+      </w:r>
+      <w:r>
+        <w:rPr>
+          <w:rFonts w:ascii="Monaco" w:hAnsi="Monaco"/>
+          <w:color w:val="A31515"/>
+          <w:sz w:val="18"/>
+          <w:szCs w:val="18"/>
+        </w:rPr>
+        <w:t>"515"</w:t>
+      </w:r>
+      <w:r>
+        <w:rPr>
+          <w:rFonts w:ascii="Monaco" w:hAnsi="Monaco"/>
+          <w:color w:val="000000"/>
+          <w:sz w:val="18"/>
+          <w:szCs w:val="18"/>
+        </w:rPr>
+        <w:t xml:space="preserve">: </w:t>
+      </w:r>
+      <w:r>
+        <w:rPr>
+          <w:rFonts w:ascii="Monaco" w:hAnsi="Monaco"/>
+          <w:color w:val="0451A5"/>
+          <w:sz w:val="18"/>
+          <w:szCs w:val="18"/>
+        </w:rPr>
+        <w:t>"villa-108"</w:t>
+      </w:r>
+      <w:r>
+        <w:rPr>
+          <w:rFonts w:ascii="Monaco" w:hAnsi="Monaco"/>
+          <w:color w:val="000000"/>
+          <w:sz w:val="18"/>
+          <w:szCs w:val="18"/>
+        </w:rPr>
+        <w:t>,</w:t>
+      </w:r>
+    </w:p>
+    <w:p>
+      <w:pPr>
+        <w:shd w:val="clear" w:color="auto" w:fill="FFFFFF"/>
+        <w:spacing w:line="270" w:lineRule="atLeast"/>
+        <w:rPr>
+          <w:rFonts w:ascii="Monaco" w:hAnsi="Monaco"/>
+          <w:color w:val="000000"/>
+          <w:sz w:val="18"/>
+          <w:szCs w:val="18"/>
+        </w:rPr>
+      </w:pPr>
+      <w:r>
+        <w:rPr>
+          <w:rFonts w:ascii="Monaco" w:hAnsi="Monaco"/>
+          <w:color w:val="000000"/>
+          <w:sz w:val="18"/>
+          <w:szCs w:val="18"/>
+        </w:rPr>
+        <w:t xml:space="preserve">        </w:t>
+      </w:r>
+      <w:r>
+        <w:rPr>
+          <w:rFonts w:ascii="Monaco" w:hAnsi="Monaco"/>
+          <w:color w:val="A31515"/>
+          <w:sz w:val="18"/>
+          <w:szCs w:val="18"/>
+        </w:rPr>
+        <w:t>"517"</w:t>
+      </w:r>
+      <w:r>
+        <w:rPr>
+          <w:rFonts w:ascii="Monaco" w:hAnsi="Monaco"/>
+          <w:color w:val="000000"/>
+          <w:sz w:val="18"/>
+          <w:szCs w:val="18"/>
+        </w:rPr>
+        <w:t xml:space="preserve">: </w:t>
+      </w:r>
+      <w:r>
+        <w:rPr>
+          <w:rFonts w:ascii="Monaco" w:hAnsi="Monaco"/>
+          <w:color w:val="0451A5"/>
+          <w:sz w:val="18"/>
+          <w:szCs w:val="18"/>
+        </w:rPr>
+        <w:t>"villa-115"</w:t>
+      </w:r>
+    </w:p>
+    <w:p>
+      <w:pPr>
+        <w:shd w:val="clear" w:color="auto" w:fill="FFFFFF"/>
+        <w:spacing w:line="270" w:lineRule="atLeast"/>
+        <w:rPr>
+          <w:rFonts w:ascii="Monaco" w:hAnsi="Monaco"/>
+          <w:color w:val="000000"/>
+          <w:sz w:val="18"/>
+          <w:szCs w:val="18"/>
+        </w:rPr>
+      </w:pPr>
+      <w:r>
+        <w:rPr>
+          <w:rFonts w:ascii="Monaco" w:hAnsi="Monaco"/>
+          <w:color w:val="000000"/>
+          <w:sz w:val="18"/>
+          <w:szCs w:val="18"/>
+        </w:rPr>
+        <w:t xml:space="preserve">    },</w:t>
+      </w:r>
+    </w:p>
+    <w:p>
+      <w:pPr>
+        <w:shd w:val="clear" w:color="auto" w:fill="FFFFFF"/>
+        <w:spacing w:line="270" w:lineRule="atLeast"/>
+        <w:rPr>
+          <w:rFonts w:ascii="Monaco" w:hAnsi="Monaco"/>
+          <w:color w:val="000000"/>
+          <w:sz w:val="18"/>
+          <w:szCs w:val="18"/>
+        </w:rPr>
+      </w:pPr>
+      <w:r>
+        <w:rPr>
+          <w:rFonts w:ascii="Monaco" w:hAnsi="Monaco"/>
+          <w:color w:val="000000"/>
+          <w:sz w:val="18"/>
+          <w:szCs w:val="18"/>
+        </w:rPr>
+        <w:t xml:space="preserve">    </w:t>
+      </w:r>
+      <w:r>
+        <w:rPr>
+          <w:rFonts w:ascii="Monaco" w:hAnsi="Monaco"/>
+          <w:color w:val="A31515"/>
+          <w:sz w:val="18"/>
+          <w:szCs w:val="18"/>
+        </w:rPr>
+        <w:t>"</w:t>
+      </w:r>
+      <w:proofErr w:type="spellStart"/>
+      <w:r>
+        <w:rPr>
+          <w:rFonts w:ascii="Monaco" w:hAnsi="Monaco"/>
+          <w:color w:val="A31515"/>
+          <w:sz w:val="18"/>
+          <w:szCs w:val="18"/>
+        </w:rPr>
+        <w:t>transactedByID</w:t>
+      </w:r>
+      <w:proofErr w:type="spellEnd"/>
+      <w:r>
+        <w:rPr>
+          <w:rFonts w:ascii="Monaco" w:hAnsi="Monaco"/>
+          <w:color w:val="A31515"/>
+          <w:sz w:val="18"/>
+          <w:szCs w:val="18"/>
+        </w:rPr>
+        <w:t>"</w:t>
+      </w:r>
+      <w:r>
+        <w:rPr>
+          <w:rFonts w:ascii="Monaco" w:hAnsi="Monaco"/>
+          <w:color w:val="000000"/>
+          <w:sz w:val="18"/>
+          <w:szCs w:val="18"/>
+        </w:rPr>
+        <w:t xml:space="preserve">: </w:t>
+      </w:r>
+      <w:r>
+        <w:rPr>
+          <w:rFonts w:ascii="Monaco" w:hAnsi="Monaco"/>
+          <w:color w:val="098658"/>
+          <w:sz w:val="18"/>
+          <w:szCs w:val="18"/>
+        </w:rPr>
+        <w:t>0</w:t>
+      </w:r>
+      <w:r>
+        <w:rPr>
+          <w:rFonts w:ascii="Monaco" w:hAnsi="Monaco"/>
+          <w:color w:val="000000"/>
+          <w:sz w:val="18"/>
+          <w:szCs w:val="18"/>
+        </w:rPr>
+        <w:t>,</w:t>
+      </w:r>
+    </w:p>
+    <w:p>
+      <w:pPr>
+        <w:shd w:val="clear" w:color="auto" w:fill="FFFFFF"/>
+        <w:spacing w:line="270" w:lineRule="atLeast"/>
+        <w:rPr>
+          <w:rFonts w:ascii="Monaco" w:hAnsi="Monaco"/>
+          <w:color w:val="000000"/>
+          <w:sz w:val="18"/>
+          <w:szCs w:val="18"/>
+        </w:rPr>
+      </w:pPr>
+      <w:r>
+        <w:rPr>
+          <w:rFonts w:ascii="Monaco" w:hAnsi="Monaco"/>
+          <w:color w:val="000000"/>
+          <w:sz w:val="18"/>
+          <w:szCs w:val="18"/>
+        </w:rPr>
+        <w:t xml:space="preserve">    </w:t>
+      </w:r>
+      <w:r>
+        <w:rPr>
+          <w:rFonts w:ascii="Monaco" w:hAnsi="Monaco"/>
+          <w:color w:val="A31515"/>
+          <w:sz w:val="18"/>
+          <w:szCs w:val="18"/>
+        </w:rPr>
+        <w:t>"</w:t>
+      </w:r>
+      <w:proofErr w:type="spellStart"/>
+      <w:r>
+        <w:rPr>
+          <w:rFonts w:ascii="Monaco" w:hAnsi="Monaco"/>
+          <w:color w:val="A31515"/>
+          <w:sz w:val="18"/>
+          <w:szCs w:val="18"/>
+        </w:rPr>
+        <w:t>transactionID</w:t>
+      </w:r>
+      <w:proofErr w:type="spellEnd"/>
+      <w:r>
+        <w:rPr>
+          <w:rFonts w:ascii="Monaco" w:hAnsi="Monaco"/>
+          <w:color w:val="A31515"/>
+          <w:sz w:val="18"/>
+          <w:szCs w:val="18"/>
+        </w:rPr>
+        <w:t>"</w:t>
+      </w:r>
+      <w:r>
+        <w:rPr>
+          <w:rFonts w:ascii="Monaco" w:hAnsi="Monaco"/>
+          <w:color w:val="000000"/>
+          <w:sz w:val="18"/>
+          <w:szCs w:val="18"/>
+        </w:rPr>
+        <w:t xml:space="preserve">: </w:t>
+      </w:r>
+      <w:r>
+        <w:rPr>
+          <w:rFonts w:ascii="Monaco" w:hAnsi="Monaco"/>
+          <w:color w:val="098658"/>
+          <w:sz w:val="18"/>
+          <w:szCs w:val="18"/>
+        </w:rPr>
+        <w:t>0</w:t>
+      </w:r>
+      <w:r>
+        <w:rPr>
+          <w:rFonts w:ascii="Monaco" w:hAnsi="Monaco"/>
+          <w:color w:val="000000"/>
+          <w:sz w:val="18"/>
+          <w:szCs w:val="18"/>
+        </w:rPr>
+        <w:t>,</w:t>
+      </w:r>
+    </w:p>
+    <w:p>
+      <w:pPr>
+        <w:shd w:val="clear" w:color="auto" w:fill="FFFFFF"/>
+        <w:spacing w:line="270" w:lineRule="atLeast"/>
+        <w:rPr>
+          <w:rFonts w:ascii="Monaco" w:hAnsi="Monaco"/>
+          <w:color w:val="000000"/>
+          <w:sz w:val="18"/>
+          <w:szCs w:val="18"/>
+        </w:rPr>
+      </w:pPr>
+      <w:r>
+        <w:rPr>
+          <w:rFonts w:ascii="Monaco" w:hAnsi="Monaco"/>
+          <w:color w:val="000000"/>
+          <w:sz w:val="18"/>
+          <w:szCs w:val="18"/>
+        </w:rPr>
+        <w:t xml:space="preserve">    </w:t>
+      </w:r>
+      <w:r>
+        <w:rPr>
+          <w:rFonts w:ascii="Monaco" w:hAnsi="Monaco"/>
+          <w:color w:val="A31515"/>
+          <w:sz w:val="18"/>
+          <w:szCs w:val="18"/>
+        </w:rPr>
+        <w:t>"success"</w:t>
+      </w:r>
+      <w:r>
+        <w:rPr>
+          <w:rFonts w:ascii="Monaco" w:hAnsi="Monaco"/>
+          <w:color w:val="000000"/>
+          <w:sz w:val="18"/>
+          <w:szCs w:val="18"/>
+        </w:rPr>
+        <w:t xml:space="preserve">: </w:t>
+      </w:r>
+      <w:r>
+        <w:rPr>
+          <w:rFonts w:ascii="Monaco" w:hAnsi="Monaco"/>
           <w:b/>
           <w:bCs/>
-          <w:sz w:val="20"/>
-          <w:szCs w:val="20"/>
-        </w:rPr>
-        <w:t>Note</w:t>
-      </w:r>
-      <w:r>
-        <w:rPr>
-          <w:b/>
-          <w:bCs/>
-          <w:sz w:val="20"/>
-          <w:szCs w:val="20"/>
-        </w:rPr>
-        <w:t>2</w:t>
-      </w:r>
-      <w:r>
-        <w:rPr>
-          <w:b/>
-          <w:bCs/>
-          <w:sz w:val="20"/>
-          <w:szCs w:val="20"/>
-        </w:rPr>
-        <w:t xml:space="preserve">: </w:t>
-      </w:r>
-      <w:r>
-        <w:rPr>
-          <w:sz w:val="20"/>
-          <w:szCs w:val="20"/>
-        </w:rPr>
-        <w:t xml:space="preserve">Here </w:t>
-      </w:r>
-      <w:proofErr w:type="spellStart"/>
-      <w:r>
-        <w:rPr>
-          <w:sz w:val="20"/>
-          <w:szCs w:val="20"/>
-        </w:rPr>
-        <w:t>blockID</w:t>
-      </w:r>
-      <w:proofErr w:type="spellEnd"/>
-      <w:r>
-        <w:rPr>
-          <w:sz w:val="20"/>
-          <w:szCs w:val="20"/>
-        </w:rPr>
-        <w:t xml:space="preserve"> is the previously selected community id from the community dropdown(</w:t>
-      </w:r>
-      <w:proofErr w:type="spellStart"/>
-      <w:r>
-        <w:rPr>
-          <w:sz w:val="20"/>
-          <w:szCs w:val="20"/>
-        </w:rPr>
-        <w:t>i.e</w:t>
-      </w:r>
-      <w:proofErr w:type="spellEnd"/>
-      <w:r>
-        <w:rPr>
-          <w:sz w:val="20"/>
-          <w:szCs w:val="20"/>
-        </w:rPr>
-        <w:t xml:space="preserve"> Key of </w:t>
-      </w:r>
-      <w:proofErr w:type="spellStart"/>
-      <w:r>
-        <w:rPr>
-          <w:rFonts w:ascii="Monaco" w:hAnsi="Monaco"/>
-          <w:color w:val="A31515"/>
-          <w:sz w:val="18"/>
-          <w:szCs w:val="18"/>
-        </w:rPr>
-        <w:t>dropDownBlocks</w:t>
-      </w:r>
-      <w:proofErr w:type="spellEnd"/>
-      <w:r>
-        <w:rPr>
-          <w:sz w:val="20"/>
-          <w:szCs w:val="20"/>
-        </w:rPr>
-        <w:t xml:space="preserve"> </w:t>
-      </w:r>
-      <w:r>
-        <w:rPr>
-          <w:sz w:val="20"/>
-          <w:szCs w:val="20"/>
-        </w:rPr>
-        <w:t>Map received in response of API No. 12b)</w:t>
-      </w:r>
-    </w:p>
-    <w:p>
-      <w:pPr>
-        <w:rPr>
-          <w:sz w:val="20"/>
-          <w:szCs w:val="20"/>
-        </w:rPr>
-      </w:pPr>
-    </w:p>
-    <w:p>
-      <w:pPr>
-        <w:rPr>
-          <w:b/>
-          <w:sz w:val="20"/>
-          <w:szCs w:val="20"/>
-        </w:rPr>
-      </w:pPr>
-      <w:r>
-        <w:rPr>
-          <w:b/>
-          <w:sz w:val="20"/>
-          <w:szCs w:val="20"/>
-        </w:rPr>
-        <w:t xml:space="preserve">Response: </w:t>
-      </w:r>
-    </w:p>
-    <w:p>
-      <w:pPr>
-        <w:shd w:val="clear" w:color="auto" w:fill="FFFFFF"/>
-        <w:spacing w:line="270" w:lineRule="atLeast"/>
-        <w:rPr>
-          <w:rFonts w:ascii="Monaco" w:hAnsi="Monaco"/>
-          <w:color w:val="000000"/>
-          <w:sz w:val="18"/>
-          <w:szCs w:val="18"/>
-        </w:rPr>
-      </w:pPr>
-      <w:r>
-        <w:rPr>
-          <w:sz w:val="17"/>
-          <w:szCs w:val="17"/>
-        </w:rPr>
-        <w:t>{</w:t>
-      </w:r>
-      <w:r>
-        <w:rPr>
-          <w:rFonts w:ascii="Monaco" w:hAnsi="Monaco"/>
-          <w:color w:val="000000"/>
-          <w:sz w:val="18"/>
-          <w:szCs w:val="18"/>
-        </w:rPr>
-        <w:t xml:space="preserve"> </w:t>
-      </w:r>
-      <w:r>
-        <w:rPr>
-          <w:rFonts w:ascii="Monaco" w:hAnsi="Monaco"/>
-          <w:color w:val="000000"/>
-          <w:sz w:val="18"/>
-          <w:szCs w:val="18"/>
-        </w:rPr>
-        <w:t>{</w:t>
-      </w:r>
-    </w:p>
-    <w:p>
-      <w:pPr>
-        <w:shd w:val="clear" w:color="auto" w:fill="FFFFFF"/>
-        <w:spacing w:line="270" w:lineRule="atLeast"/>
-        <w:rPr>
-          <w:rFonts w:ascii="Monaco" w:hAnsi="Monaco"/>
-          <w:color w:val="000000"/>
-          <w:sz w:val="18"/>
-          <w:szCs w:val="18"/>
-        </w:rPr>
-      </w:pPr>
-      <w:r>
-        <w:rPr>
-          <w:rFonts w:ascii="Monaco" w:hAnsi="Monaco"/>
-          <w:color w:val="000000"/>
-          <w:sz w:val="18"/>
-          <w:szCs w:val="18"/>
-        </w:rPr>
-        <w:t xml:space="preserve">    </w:t>
-      </w:r>
-      <w:r>
-        <w:rPr>
-          <w:rFonts w:ascii="Monaco" w:hAnsi="Monaco"/>
-          <w:color w:val="A31515"/>
-          <w:sz w:val="18"/>
-          <w:szCs w:val="18"/>
-        </w:rPr>
-        <w:t>"</w:t>
-      </w:r>
-      <w:proofErr w:type="spellStart"/>
-      <w:r>
-        <w:rPr>
-          <w:rFonts w:ascii="Monaco" w:hAnsi="Monaco"/>
-          <w:color w:val="A31515"/>
-          <w:sz w:val="18"/>
-          <w:szCs w:val="18"/>
-        </w:rPr>
-        <w:t>dropDownCustomers</w:t>
-      </w:r>
-      <w:proofErr w:type="spellEnd"/>
-      <w:r>
-        <w:rPr>
-          <w:rFonts w:ascii="Monaco" w:hAnsi="Monaco"/>
-          <w:color w:val="A31515"/>
-          <w:sz w:val="18"/>
-          <w:szCs w:val="18"/>
-        </w:rPr>
-        <w:t>"</w:t>
-      </w:r>
-      <w:r>
-        <w:rPr>
-          <w:rFonts w:ascii="Monaco" w:hAnsi="Monaco"/>
-          <w:color w:val="000000"/>
-          <w:sz w:val="18"/>
-          <w:szCs w:val="18"/>
-        </w:rPr>
-        <w:t>: {</w:t>
-      </w:r>
-    </w:p>
-    <w:p>
-      <w:pPr>
-        <w:shd w:val="clear" w:color="auto" w:fill="FFFFFF"/>
-        <w:spacing w:line="270" w:lineRule="atLeast"/>
-        <w:rPr>
-          <w:rFonts w:ascii="Monaco" w:hAnsi="Monaco"/>
-          <w:color w:val="000000"/>
-          <w:sz w:val="18"/>
-          <w:szCs w:val="18"/>
-        </w:rPr>
-      </w:pPr>
-      <w:r>
-        <w:rPr>
-          <w:rFonts w:ascii="Monaco" w:hAnsi="Monaco"/>
-          <w:color w:val="000000"/>
-          <w:sz w:val="18"/>
-          <w:szCs w:val="18"/>
-        </w:rPr>
-        <w:t xml:space="preserve">        </w:t>
-      </w:r>
-      <w:r>
-        <w:rPr>
-          <w:rFonts w:ascii="Monaco" w:hAnsi="Monaco"/>
-          <w:color w:val="A31515"/>
-          <w:sz w:val="18"/>
-          <w:szCs w:val="18"/>
-        </w:rPr>
-        <w:t>"512"</w:t>
-      </w:r>
-      <w:r>
-        <w:rPr>
-          <w:rFonts w:ascii="Monaco" w:hAnsi="Monaco"/>
-          <w:color w:val="000000"/>
-          <w:sz w:val="18"/>
-          <w:szCs w:val="18"/>
-        </w:rPr>
-        <w:t xml:space="preserve">: </w:t>
-      </w:r>
-      <w:r>
-        <w:rPr>
-          <w:rFonts w:ascii="Monaco" w:hAnsi="Monaco"/>
           <w:color w:val="0451A5"/>
           <w:sz w:val="18"/>
           <w:szCs w:val="18"/>
         </w:rPr>
-        <w:t>"MHA96"</w:t>
-      </w:r>
-      <w:r>
-        <w:rPr>
-          <w:rFonts w:ascii="Monaco" w:hAnsi="Monaco"/>
-          <w:color w:val="000000"/>
-          <w:sz w:val="18"/>
-          <w:szCs w:val="18"/>
-        </w:rPr>
-        <w:t>,</w:t>
-      </w:r>
-    </w:p>
-    <w:p>
-      <w:pPr>
-        <w:shd w:val="clear" w:color="auto" w:fill="FFFFFF"/>
-        <w:spacing w:line="270" w:lineRule="atLeast"/>
-        <w:rPr>
-          <w:rFonts w:ascii="Monaco" w:hAnsi="Monaco"/>
-          <w:color w:val="000000"/>
-          <w:sz w:val="18"/>
-          <w:szCs w:val="18"/>
-        </w:rPr>
-      </w:pPr>
-      <w:r>
-        <w:rPr>
-          <w:rFonts w:ascii="Monaco" w:hAnsi="Monaco"/>
-          <w:color w:val="000000"/>
-          <w:sz w:val="18"/>
-          <w:szCs w:val="18"/>
-        </w:rPr>
-        <w:t xml:space="preserve">        </w:t>
-      </w:r>
-      <w:r>
-        <w:rPr>
-          <w:rFonts w:ascii="Monaco" w:hAnsi="Monaco"/>
-          <w:color w:val="A31515"/>
-          <w:sz w:val="18"/>
-          <w:szCs w:val="18"/>
-        </w:rPr>
-        <w:t>"513"</w:t>
-      </w:r>
-      <w:r>
-        <w:rPr>
-          <w:rFonts w:ascii="Monaco" w:hAnsi="Monaco"/>
-          <w:color w:val="000000"/>
-          <w:sz w:val="18"/>
-          <w:szCs w:val="18"/>
-        </w:rPr>
-        <w:t xml:space="preserve">: </w:t>
-      </w:r>
-      <w:r>
-        <w:rPr>
-          <w:rFonts w:ascii="Monaco" w:hAnsi="Monaco"/>
-          <w:color w:val="0451A5"/>
-          <w:sz w:val="18"/>
-          <w:szCs w:val="18"/>
-        </w:rPr>
-        <w:t>"MHA98"</w:t>
-      </w:r>
-      <w:r>
-        <w:rPr>
-          <w:rFonts w:ascii="Monaco" w:hAnsi="Monaco"/>
-          <w:color w:val="000000"/>
-          <w:sz w:val="18"/>
-          <w:szCs w:val="18"/>
-        </w:rPr>
-        <w:t>,</w:t>
-      </w:r>
-    </w:p>
-    <w:p>
-      <w:pPr>
-        <w:shd w:val="clear" w:color="auto" w:fill="FFFFFF"/>
-        <w:spacing w:line="270" w:lineRule="atLeast"/>
-        <w:rPr>
-          <w:rFonts w:ascii="Monaco" w:hAnsi="Monaco"/>
-          <w:color w:val="000000"/>
-          <w:sz w:val="18"/>
-          <w:szCs w:val="18"/>
-        </w:rPr>
-      </w:pPr>
-      <w:r>
-        <w:rPr>
-          <w:rFonts w:ascii="Monaco" w:hAnsi="Monaco"/>
-          <w:color w:val="000000"/>
-          <w:sz w:val="18"/>
-          <w:szCs w:val="18"/>
-        </w:rPr>
-        <w:t xml:space="preserve">        </w:t>
-      </w:r>
-      <w:r>
-        <w:rPr>
-          <w:rFonts w:ascii="Monaco" w:hAnsi="Monaco"/>
-          <w:color w:val="A31515"/>
-          <w:sz w:val="18"/>
-          <w:szCs w:val="18"/>
-        </w:rPr>
-        <w:t>"2"</w:t>
-      </w:r>
-      <w:r>
-        <w:rPr>
-          <w:rFonts w:ascii="Monaco" w:hAnsi="Monaco"/>
-          <w:color w:val="000000"/>
-          <w:sz w:val="18"/>
-          <w:szCs w:val="18"/>
-        </w:rPr>
-        <w:t xml:space="preserve">: </w:t>
-      </w:r>
-      <w:r>
-        <w:rPr>
-          <w:rFonts w:ascii="Monaco" w:hAnsi="Monaco"/>
-          <w:color w:val="0451A5"/>
-          <w:sz w:val="18"/>
-          <w:szCs w:val="18"/>
-        </w:rPr>
-        <w:t>"MHA022"</w:t>
-      </w:r>
-      <w:r>
-        <w:rPr>
-          <w:rFonts w:ascii="Monaco" w:hAnsi="Monaco"/>
-          <w:color w:val="000000"/>
-          <w:sz w:val="18"/>
-          <w:szCs w:val="18"/>
-        </w:rPr>
-        <w:t>,</w:t>
-      </w:r>
-    </w:p>
-    <w:p>
-      <w:pPr>
-        <w:shd w:val="clear" w:color="auto" w:fill="FFFFFF"/>
-        <w:spacing w:line="270" w:lineRule="atLeast"/>
-        <w:rPr>
-          <w:rFonts w:ascii="Monaco" w:hAnsi="Monaco"/>
-          <w:color w:val="000000"/>
-          <w:sz w:val="18"/>
-          <w:szCs w:val="18"/>
-        </w:rPr>
-      </w:pPr>
-      <w:r>
-        <w:rPr>
-          <w:rFonts w:ascii="Monaco" w:hAnsi="Monaco"/>
-          <w:color w:val="000000"/>
-          <w:sz w:val="18"/>
-          <w:szCs w:val="18"/>
-        </w:rPr>
-        <w:t xml:space="preserve">        </w:t>
-      </w:r>
-      <w:r>
-        <w:rPr>
-          <w:rFonts w:ascii="Monaco" w:hAnsi="Monaco"/>
-          <w:color w:val="A31515"/>
-          <w:sz w:val="18"/>
-          <w:szCs w:val="18"/>
-        </w:rPr>
-        <w:t>"514"</w:t>
-      </w:r>
-      <w:r>
-        <w:rPr>
-          <w:rFonts w:ascii="Monaco" w:hAnsi="Monaco"/>
-          <w:color w:val="000000"/>
-          <w:sz w:val="18"/>
-          <w:szCs w:val="18"/>
-        </w:rPr>
-        <w:t xml:space="preserve">: </w:t>
-      </w:r>
-      <w:r>
-        <w:rPr>
-          <w:rFonts w:ascii="Monaco" w:hAnsi="Monaco"/>
-          <w:color w:val="0451A5"/>
-          <w:sz w:val="18"/>
-          <w:szCs w:val="18"/>
-        </w:rPr>
-        <w:t>"MHA103"</w:t>
-      </w:r>
-      <w:r>
-        <w:rPr>
-          <w:rFonts w:ascii="Monaco" w:hAnsi="Monaco"/>
-          <w:color w:val="000000"/>
-          <w:sz w:val="18"/>
-          <w:szCs w:val="18"/>
-        </w:rPr>
-        <w:t>,</w:t>
-      </w:r>
-    </w:p>
-    <w:p>
-      <w:pPr>
-        <w:shd w:val="clear" w:color="auto" w:fill="FFFFFF"/>
-        <w:spacing w:line="270" w:lineRule="atLeast"/>
-        <w:rPr>
-          <w:rFonts w:ascii="Monaco" w:hAnsi="Monaco"/>
-          <w:color w:val="000000"/>
-          <w:sz w:val="18"/>
-          <w:szCs w:val="18"/>
-        </w:rPr>
-      </w:pPr>
-      <w:r>
-        <w:rPr>
-          <w:rFonts w:ascii="Monaco" w:hAnsi="Monaco"/>
-          <w:color w:val="000000"/>
-          <w:sz w:val="18"/>
-          <w:szCs w:val="18"/>
-        </w:rPr>
-        <w:t xml:space="preserve">        </w:t>
-      </w:r>
-      <w:r>
-        <w:rPr>
-          <w:rFonts w:ascii="Monaco" w:hAnsi="Monaco"/>
-          <w:color w:val="A31515"/>
-          <w:sz w:val="18"/>
-          <w:szCs w:val="18"/>
-        </w:rPr>
-        <w:t>"515"</w:t>
-      </w:r>
-      <w:r>
-        <w:rPr>
-          <w:rFonts w:ascii="Monaco" w:hAnsi="Monaco"/>
-          <w:color w:val="000000"/>
-          <w:sz w:val="18"/>
-          <w:szCs w:val="18"/>
-        </w:rPr>
-        <w:t xml:space="preserve">: </w:t>
-      </w:r>
-      <w:r>
-        <w:rPr>
-          <w:rFonts w:ascii="Monaco" w:hAnsi="Monaco"/>
-          <w:color w:val="0451A5"/>
-          <w:sz w:val="18"/>
-          <w:szCs w:val="18"/>
-        </w:rPr>
-        <w:t>"MHA108"</w:t>
-      </w:r>
-      <w:r>
-        <w:rPr>
-          <w:rFonts w:ascii="Monaco" w:hAnsi="Monaco"/>
-          <w:color w:val="000000"/>
-          <w:sz w:val="18"/>
-          <w:szCs w:val="18"/>
-        </w:rPr>
-        <w:t>,</w:t>
-      </w:r>
-    </w:p>
-    <w:p>
-      <w:pPr>
-        <w:shd w:val="clear" w:color="auto" w:fill="FFFFFF"/>
-        <w:spacing w:line="270" w:lineRule="atLeast"/>
-        <w:rPr>
-          <w:rFonts w:ascii="Monaco" w:hAnsi="Monaco"/>
-          <w:color w:val="000000"/>
-          <w:sz w:val="18"/>
-          <w:szCs w:val="18"/>
-        </w:rPr>
-      </w:pPr>
-      <w:r>
-        <w:rPr>
-          <w:rFonts w:ascii="Monaco" w:hAnsi="Monaco"/>
-          <w:color w:val="000000"/>
-          <w:sz w:val="18"/>
-          <w:szCs w:val="18"/>
-        </w:rPr>
-        <w:t xml:space="preserve">        </w:t>
-      </w:r>
-      <w:r>
-        <w:rPr>
-          <w:rFonts w:ascii="Monaco" w:hAnsi="Monaco"/>
-          <w:color w:val="A31515"/>
-          <w:sz w:val="18"/>
-          <w:szCs w:val="18"/>
-        </w:rPr>
-        <w:t>"517"</w:t>
-      </w:r>
-      <w:r>
-        <w:rPr>
-          <w:rFonts w:ascii="Monaco" w:hAnsi="Monaco"/>
-          <w:color w:val="000000"/>
-          <w:sz w:val="18"/>
-          <w:szCs w:val="18"/>
-        </w:rPr>
-        <w:t xml:space="preserve">: </w:t>
-      </w:r>
-      <w:r>
-        <w:rPr>
-          <w:rFonts w:ascii="Monaco" w:hAnsi="Monaco"/>
-          <w:color w:val="0451A5"/>
-          <w:sz w:val="18"/>
-          <w:szCs w:val="18"/>
-        </w:rPr>
-        <w:t>"MHA115"</w:t>
-      </w:r>
-      <w:r>
-        <w:rPr>
-          <w:rFonts w:ascii="Monaco" w:hAnsi="Monaco"/>
-          <w:color w:val="000000"/>
-          <w:sz w:val="18"/>
-          <w:szCs w:val="18"/>
-        </w:rPr>
-        <w:t>,</w:t>
-      </w:r>
-    </w:p>
-    <w:p>
-      <w:pPr>
-        <w:shd w:val="clear" w:color="auto" w:fill="FFFFFF"/>
-        <w:spacing w:line="270" w:lineRule="atLeast"/>
-        <w:rPr>
-          <w:rFonts w:ascii="Monaco" w:hAnsi="Monaco"/>
-          <w:color w:val="000000"/>
-          <w:sz w:val="18"/>
-          <w:szCs w:val="18"/>
-        </w:rPr>
-      </w:pPr>
-      <w:r>
-        <w:rPr>
-          <w:rFonts w:ascii="Monaco" w:hAnsi="Monaco"/>
-          <w:color w:val="000000"/>
-          <w:sz w:val="18"/>
-          <w:szCs w:val="18"/>
-        </w:rPr>
-        <w:t xml:space="preserve">        </w:t>
-      </w:r>
-      <w:r>
-        <w:rPr>
-          <w:rFonts w:ascii="Monaco" w:hAnsi="Monaco"/>
-          <w:color w:val="A31515"/>
-          <w:sz w:val="18"/>
-          <w:szCs w:val="18"/>
-        </w:rPr>
-        <w:t>"6"</w:t>
-      </w:r>
-      <w:r>
-        <w:rPr>
-          <w:rFonts w:ascii="Monaco" w:hAnsi="Monaco"/>
-          <w:color w:val="000000"/>
-          <w:sz w:val="18"/>
-          <w:szCs w:val="18"/>
-        </w:rPr>
-        <w:t xml:space="preserve">: </w:t>
-      </w:r>
-      <w:r>
-        <w:rPr>
-          <w:rFonts w:ascii="Monaco" w:hAnsi="Monaco"/>
-          <w:color w:val="0451A5"/>
-          <w:sz w:val="18"/>
-          <w:szCs w:val="18"/>
-        </w:rPr>
-        <w:t>"MHA026"</w:t>
-      </w:r>
-      <w:r>
-        <w:rPr>
-          <w:rFonts w:ascii="Monaco" w:hAnsi="Monaco"/>
-          <w:color w:val="000000"/>
-          <w:sz w:val="18"/>
-          <w:szCs w:val="18"/>
-        </w:rPr>
-        <w:t>,</w:t>
-      </w:r>
-    </w:p>
-    <w:p>
-      <w:pPr>
-        <w:shd w:val="clear" w:color="auto" w:fill="FFFFFF"/>
-        <w:spacing w:line="270" w:lineRule="atLeast"/>
-        <w:rPr>
-          <w:rFonts w:ascii="Monaco" w:hAnsi="Monaco"/>
-          <w:color w:val="000000"/>
-          <w:sz w:val="18"/>
-          <w:szCs w:val="18"/>
-        </w:rPr>
-      </w:pPr>
-      <w:r>
-        <w:rPr>
-          <w:rFonts w:ascii="Monaco" w:hAnsi="Monaco"/>
-          <w:color w:val="000000"/>
-          <w:sz w:val="18"/>
-          <w:szCs w:val="18"/>
-        </w:rPr>
-        <w:t xml:space="preserve">        </w:t>
-      </w:r>
-      <w:r>
-        <w:rPr>
-          <w:rFonts w:ascii="Monaco" w:hAnsi="Monaco"/>
-          <w:color w:val="A31515"/>
-          <w:sz w:val="18"/>
-          <w:szCs w:val="18"/>
-        </w:rPr>
-        <w:t>"518"</w:t>
-      </w:r>
-      <w:r>
-        <w:rPr>
-          <w:rFonts w:ascii="Monaco" w:hAnsi="Monaco"/>
-          <w:color w:val="000000"/>
-          <w:sz w:val="18"/>
-          <w:szCs w:val="18"/>
-        </w:rPr>
-        <w:t xml:space="preserve">: </w:t>
-      </w:r>
-      <w:r>
-        <w:rPr>
-          <w:rFonts w:ascii="Monaco" w:hAnsi="Monaco"/>
-          <w:color w:val="0451A5"/>
-          <w:sz w:val="18"/>
-          <w:szCs w:val="18"/>
-        </w:rPr>
-        <w:t>"MHA117"</w:t>
-      </w:r>
-    </w:p>
-    <w:p>
-      <w:pPr>
-        <w:shd w:val="clear" w:color="auto" w:fill="FFFFFF"/>
-        <w:spacing w:line="270" w:lineRule="atLeast"/>
-        <w:rPr>
-          <w:rFonts w:ascii="Monaco" w:hAnsi="Monaco"/>
-          <w:color w:val="000000"/>
-          <w:sz w:val="18"/>
-          <w:szCs w:val="18"/>
-        </w:rPr>
-      </w:pPr>
-      <w:r>
-        <w:rPr>
-          <w:rFonts w:ascii="Monaco" w:hAnsi="Monaco"/>
-          <w:color w:val="000000"/>
-          <w:sz w:val="18"/>
-          <w:szCs w:val="18"/>
-        </w:rPr>
-        <w:t xml:space="preserve">    },</w:t>
-      </w:r>
-    </w:p>
-    <w:p>
-      <w:pPr>
-        <w:shd w:val="clear" w:color="auto" w:fill="FFFFFF"/>
-        <w:spacing w:line="270" w:lineRule="atLeast"/>
-        <w:rPr>
-          <w:rFonts w:ascii="Monaco" w:hAnsi="Monaco"/>
-          <w:color w:val="000000"/>
-          <w:sz w:val="18"/>
-          <w:szCs w:val="18"/>
-        </w:rPr>
-      </w:pPr>
-      <w:r>
-        <w:rPr>
-          <w:rFonts w:ascii="Monaco" w:hAnsi="Monaco"/>
-          <w:color w:val="000000"/>
-          <w:sz w:val="18"/>
-          <w:szCs w:val="18"/>
-        </w:rPr>
-        <w:t xml:space="preserve">    </w:t>
-      </w:r>
-      <w:r>
-        <w:rPr>
-          <w:rFonts w:ascii="Monaco" w:hAnsi="Monaco"/>
-          <w:color w:val="A31515"/>
-          <w:sz w:val="18"/>
-          <w:szCs w:val="18"/>
-        </w:rPr>
-        <w:t>"</w:t>
-      </w:r>
-      <w:proofErr w:type="spellStart"/>
-      <w:r>
-        <w:rPr>
-          <w:rFonts w:ascii="Monaco" w:hAnsi="Monaco"/>
-          <w:color w:val="A31515"/>
-          <w:sz w:val="18"/>
-          <w:szCs w:val="18"/>
-        </w:rPr>
-        <w:t>transactedByID</w:t>
-      </w:r>
-      <w:proofErr w:type="spellEnd"/>
-      <w:r>
-        <w:rPr>
-          <w:rFonts w:ascii="Monaco" w:hAnsi="Monaco"/>
-          <w:color w:val="A31515"/>
-          <w:sz w:val="18"/>
-          <w:szCs w:val="18"/>
-        </w:rPr>
-        <w:t>"</w:t>
-      </w:r>
-      <w:r>
-        <w:rPr>
-          <w:rFonts w:ascii="Monaco" w:hAnsi="Monaco"/>
-          <w:color w:val="000000"/>
-          <w:sz w:val="18"/>
-          <w:szCs w:val="18"/>
-        </w:rPr>
-        <w:t xml:space="preserve">: </w:t>
-      </w:r>
-      <w:r>
-        <w:rPr>
-          <w:rFonts w:ascii="Monaco" w:hAnsi="Monaco"/>
-          <w:color w:val="098658"/>
-          <w:sz w:val="18"/>
-          <w:szCs w:val="18"/>
-        </w:rPr>
-        <w:t>0</w:t>
-      </w:r>
-      <w:r>
-        <w:rPr>
-          <w:rFonts w:ascii="Monaco" w:hAnsi="Monaco"/>
-          <w:color w:val="000000"/>
-          <w:sz w:val="18"/>
-          <w:szCs w:val="18"/>
-        </w:rPr>
-        <w:t>,</w:t>
-      </w:r>
-    </w:p>
-    <w:p>
-      <w:pPr>
-        <w:shd w:val="clear" w:color="auto" w:fill="FFFFFF"/>
-        <w:spacing w:line="270" w:lineRule="atLeast"/>
-        <w:rPr>
-          <w:rFonts w:ascii="Monaco" w:hAnsi="Monaco"/>
-          <w:color w:val="000000"/>
-          <w:sz w:val="18"/>
-          <w:szCs w:val="18"/>
-        </w:rPr>
-      </w:pPr>
-      <w:r>
-        <w:rPr>
-          <w:rFonts w:ascii="Monaco" w:hAnsi="Monaco"/>
-          <w:color w:val="000000"/>
-          <w:sz w:val="18"/>
-          <w:szCs w:val="18"/>
-        </w:rPr>
-        <w:t xml:space="preserve">    </w:t>
-      </w:r>
-      <w:r>
-        <w:rPr>
-          <w:rFonts w:ascii="Monaco" w:hAnsi="Monaco"/>
-          <w:color w:val="A31515"/>
-          <w:sz w:val="18"/>
-          <w:szCs w:val="18"/>
-        </w:rPr>
-        <w:t>"</w:t>
-      </w:r>
-      <w:proofErr w:type="spellStart"/>
-      <w:r>
-        <w:rPr>
-          <w:rFonts w:ascii="Monaco" w:hAnsi="Monaco"/>
-          <w:color w:val="A31515"/>
-          <w:sz w:val="18"/>
-          <w:szCs w:val="18"/>
-        </w:rPr>
-        <w:t>transactionID</w:t>
-      </w:r>
-      <w:proofErr w:type="spellEnd"/>
-      <w:r>
-        <w:rPr>
-          <w:rFonts w:ascii="Monaco" w:hAnsi="Monaco"/>
-          <w:color w:val="A31515"/>
-          <w:sz w:val="18"/>
-          <w:szCs w:val="18"/>
-        </w:rPr>
-        <w:t>"</w:t>
-      </w:r>
-      <w:r>
-        <w:rPr>
-          <w:rFonts w:ascii="Monaco" w:hAnsi="Monaco"/>
-          <w:color w:val="000000"/>
-          <w:sz w:val="18"/>
-          <w:szCs w:val="18"/>
-        </w:rPr>
-        <w:t xml:space="preserve">: </w:t>
-      </w:r>
-      <w:r>
-        <w:rPr>
-          <w:rFonts w:ascii="Monaco" w:hAnsi="Monaco"/>
-          <w:color w:val="098658"/>
-          <w:sz w:val="18"/>
-          <w:szCs w:val="18"/>
-        </w:rPr>
-        <w:t>0</w:t>
+        <w:t>false</w:t>
       </w:r>
     </w:p>
     <w:p>
@@ -20873,7 +21192,7 @@
   <w:style w:type="paragraph" w:default="1" w:styleId="Normal">
     <w:name w:val="Normal"/>
     <w:qFormat/>
-    <w:rsid w:val="00D804DF"/>
+    <w:rsid w:val="009B73D6"/>
     <w:pPr>
       <w:spacing w:line="240" w:lineRule="auto"/>
     </w:pPr>

</xml_diff>